<commit_message>
Update publications and journals papers
</commit_message>
<xml_diff>
--- a/web/index_academia.docx
+++ b/web/index_academia.docx
@@ -6,11 +6,11 @@
       <w:pPr>
         <w:pStyle w:val="Heading1"/>
       </w:pPr>
-      <w:bookmarkStart w:id="20" w:name="stefanos-georgiou"/>
+      <w:bookmarkStart w:id="9" w:name="_1cd96cd678c5ca2af2c89b33c6280df7b55673e"/>
       <w:r>
         <w:t xml:space="preserve">Stefanos Georgiou</w:t>
       </w:r>
-      <w:bookmarkEnd w:id="20"/>
+      <w:bookmarkEnd w:id="9"/>
     </w:p>
     <w:p>
       <w:r>
@@ -26,6 +26,7 @@
       <w:r>
         <w:rPr>
           <w:b/>
+          <w:bCs/>
         </w:rPr>
         <w:t xml:space="preserve">Contact details</w:t>
       </w:r>
@@ -40,6 +41,7 @@
       <w:r>
         <w:rPr>
           <w:b/>
+          <w:bCs/>
         </w:rPr>
         <w:t xml:space="preserve">About me</w:t>
       </w:r>
@@ -49,7 +51,7 @@
       <w:r>
         <w:t xml:space="preserve"> </w:t>
       </w:r>
-      <w:hyperlink r:id="rId21">
+      <w:hyperlink r:id="rId10">
         <w:r>
           <w:rPr>
             <w:rStyle w:val="Hyperlink"/>
@@ -63,7 +65,7 @@
       <w:r>
         <w:t xml:space="preserve"> </w:t>
       </w:r>
-      <w:hyperlink r:id="rId22">
+      <w:hyperlink r:id="rId11">
         <w:r>
           <w:rPr>
             <w:rStyle w:val="Hyperlink"/>
@@ -86,11 +88,11 @@
       <w:pPr>
         <w:pStyle w:val="Heading2"/>
       </w:pPr>
-      <w:bookmarkStart w:id="23" w:name="education"/>
+      <w:bookmarkStart w:id="12" w:name="_education"/>
       <w:r>
         <w:t xml:space="preserve">Education</w:t>
       </w:r>
-      <w:bookmarkEnd w:id="23"/>
+      <w:bookmarkEnd w:id="12"/>
     </w:p>
     <w:p>
       <w:pPr>
@@ -107,6 +109,7 @@
       <w:r>
         <w:rPr>
           <w:b/>
+          <w:bCs/>
         </w:rPr>
         <w:t xml:space="preserve">PostDoctoral, Electrical and Computer Engineering</w:t>
       </w:r>
@@ -132,7 +135,7 @@
       <w:r>
         <w:t xml:space="preserve"> </w:t>
       </w:r>
-      <w:hyperlink r:id="rId24">
+      <w:hyperlink r:id="rId13">
         <w:r>
           <w:rPr>
             <w:rStyle w:val="Hyperlink"/>
@@ -156,6 +159,7 @@
       <w:r>
         <w:rPr>
           <w:b/>
+          <w:bCs/>
         </w:rPr>
         <w:t xml:space="preserve">PhD, Computer Science</w:t>
       </w:r>
@@ -176,6 +180,7 @@
       <w:r>
         <w:rPr>
           <w:i/>
+          <w:iCs/>
         </w:rPr>
         <w:t xml:space="preserve">Energy and Run-Time Performance Practices in Software Engineering</w:t>
       </w:r>
@@ -185,7 +190,7 @@
       <w:r>
         <w:t xml:space="preserve"> </w:t>
       </w:r>
-      <w:hyperlink r:id="rId25">
+      <w:hyperlink r:id="rId14">
         <w:r>
           <w:rPr>
             <w:rStyle w:val="Hyperlink"/>
@@ -204,7 +209,7 @@
       <w:r>
         <w:t xml:space="preserve"> </w:t>
       </w:r>
-      <w:hyperlink r:id="rId26">
+      <w:hyperlink r:id="rId15">
         <w:r>
           <w:rPr>
             <w:rStyle w:val="Hyperlink"/>
@@ -218,7 +223,7 @@
       <w:r>
         <w:t xml:space="preserve"> </w:t>
       </w:r>
-      <w:hyperlink r:id="rId27">
+      <w:hyperlink r:id="rId16">
         <w:r>
           <w:rPr>
             <w:rStyle w:val="Hyperlink"/>
@@ -232,7 +237,7 @@
       <w:r>
         <w:t xml:space="preserve"> </w:t>
       </w:r>
-      <w:hyperlink r:id="rId28">
+      <w:hyperlink r:id="rId17">
         <w:r>
           <w:rPr>
             <w:rStyle w:val="Hyperlink"/>
@@ -256,6 +261,7 @@
       <w:r>
         <w:rPr>
           <w:b/>
+          <w:bCs/>
         </w:rPr>
         <w:t xml:space="preserve">MSc, Pervasive Computing and Communications for Sustainable Development (PERCCOM)</w:t>
       </w:r>
@@ -276,6 +282,7 @@
       <w:r>
         <w:rPr>
           <w:i/>
+          <w:iCs/>
         </w:rPr>
         <w:t xml:space="preserve">Implementating Green IT Approach for Transferring Big Data over Parallel Data Links</w:t>
       </w:r>
@@ -285,7 +292,7 @@
       <w:r>
         <w:t xml:space="preserve"> </w:t>
       </w:r>
-      <w:hyperlink r:id="rId29">
+      <w:hyperlink r:id="rId18">
         <w:r>
           <w:rPr>
             <w:rStyle w:val="Hyperlink"/>
@@ -307,13 +314,14 @@
       <w:r>
         <w:rPr>
           <w:i/>
+          <w:iCs/>
         </w:rPr>
         <w:t xml:space="preserve">Resource Efficient Pervasive Computing Systems and Communications</w:t>
       </w:r>
       <w:r>
         <w:t xml:space="preserve"> </w:t>
       </w:r>
-      <w:hyperlink r:id="rId30">
+      <w:hyperlink r:id="rId19">
         <w:r>
           <w:rPr>
             <w:rStyle w:val="Hyperlink"/>
@@ -335,13 +343,14 @@
       <w:r>
         <w:rPr>
           <w:i/>
+          <w:iCs/>
         </w:rPr>
         <w:t xml:space="preserve">Smart Software and Services</w:t>
       </w:r>
       <w:r>
         <w:t xml:space="preserve"> </w:t>
       </w:r>
-      <w:hyperlink r:id="rId31">
+      <w:hyperlink r:id="rId20">
         <w:r>
           <w:rPr>
             <w:rStyle w:val="Hyperlink"/>
@@ -363,13 +372,14 @@
       <w:r>
         <w:rPr>
           <w:i/>
+          <w:iCs/>
         </w:rPr>
         <w:t xml:space="preserve">Sustainable Computer Network Engineering</w:t>
       </w:r>
       <w:r>
         <w:t xml:space="preserve"> </w:t>
       </w:r>
-      <w:hyperlink r:id="rId32">
+      <w:hyperlink r:id="rId21">
         <w:r>
           <w:rPr>
             <w:rStyle w:val="Hyperlink"/>
@@ -393,6 +403,7 @@
       <w:r>
         <w:rPr>
           <w:b/>
+          <w:bCs/>
         </w:rPr>
         <w:t xml:space="preserve">BSc, Networks and Systems Programming</w:t>
       </w:r>
@@ -413,6 +424,7 @@
       <w:r>
         <w:rPr>
           <w:i/>
+          <w:iCs/>
         </w:rPr>
         <w:t xml:space="preserve">Implementation and Evaluation of the Biologically – Inspired AntHocNet Routing Protocol in Sensor Network</w:t>
       </w:r>
@@ -422,7 +434,7 @@
       <w:r>
         <w:t xml:space="preserve"> </w:t>
       </w:r>
-      <w:hyperlink r:id="rId33">
+      <w:hyperlink r:id="rId22">
         <w:r>
           <w:rPr>
             <w:rStyle w:val="Hyperlink"/>
@@ -435,35 +447,36 @@
       <w:pPr>
         <w:pStyle w:val="Heading2"/>
       </w:pPr>
-      <w:bookmarkStart w:id="34" w:name="research-publications"/>
+      <w:bookmarkStart w:id="23" w:name="_799e40edb6d63cc9c91a5b880a6b1cab320f023"/>
       <w:r>
         <w:t xml:space="preserve">Research Publications</w:t>
       </w:r>
-      <w:bookmarkEnd w:id="34"/>
-    </w:p>
-    <w:p>
-      <w:pPr>
+      <w:bookmarkEnd w:id="23"/>
+    </w:p>
+    <w:p>
+      <w:pPr>
+        <w:pStyle w:val="Compact"/>
         <w:numPr>
           <w:ilvl w:val="0"/>
           <w:numId w:val="1001"/>
         </w:numPr>
+      </w:pPr>
+      <w:r>
+        <w:t xml:space="preserve">Conference Papers</w:t>
+      </w:r>
+    </w:p>
+    <w:p>
+      <w:pPr>
         <w:pStyle w:val="Compact"/>
-      </w:pPr>
-      <w:r>
-        <w:t xml:space="preserve">Conference Papers</w:t>
-      </w:r>
-    </w:p>
-    <w:p>
-      <w:pPr>
         <w:numPr>
           <w:ilvl w:val="1"/>
           <w:numId w:val="1002"/>
         </w:numPr>
-        <w:pStyle w:val="Compact"/>
       </w:pPr>
       <w:r>
         <w:rPr>
           <w:b/>
+          <w:bCs/>
         </w:rPr>
         <w:t xml:space="preserve">Stefanos Georgiou</w:t>
       </w:r>
@@ -479,7 +492,7 @@
       <w:r>
         <w:t xml:space="preserve">[</w:t>
       </w:r>
-      <w:hyperlink r:id="rId35">
+      <w:hyperlink r:id="rId24">
         <w:r>
           <w:rPr>
             <w:rStyle w:val="Hyperlink"/>
@@ -490,7 +503,7 @@
       <w:r>
         <w:t xml:space="preserve">] [</w:t>
       </w:r>
-      <w:hyperlink r:id="rId36">
+      <w:hyperlink r:id="rId25">
         <w:r>
           <w:rPr>
             <w:rStyle w:val="Hyperlink"/>
@@ -504,15 +517,16 @@
     </w:p>
     <w:p>
       <w:pPr>
+        <w:pStyle w:val="Compact"/>
         <w:numPr>
           <w:ilvl w:val="1"/>
           <w:numId w:val="1002"/>
         </w:numPr>
-        <w:pStyle w:val="Compact"/>
       </w:pPr>
       <w:r>
         <w:rPr>
           <w:b/>
+          <w:bCs/>
         </w:rPr>
         <w:t xml:space="preserve">Stefanos Georgiou</w:t>
       </w:r>
@@ -528,7 +542,7 @@
       <w:r>
         <w:t xml:space="preserve">[</w:t>
       </w:r>
-      <w:hyperlink r:id="rId37">
+      <w:hyperlink r:id="rId26">
         <w:r>
           <w:rPr>
             <w:rStyle w:val="Hyperlink"/>
@@ -539,7 +553,7 @@
       <w:r>
         <w:t xml:space="preserve">] [</w:t>
       </w:r>
-      <w:hyperlink r:id="rId38">
+      <w:hyperlink r:id="rId27">
         <w:r>
           <w:rPr>
             <w:rStyle w:val="Hyperlink"/>
@@ -550,7 +564,7 @@
       <w:r>
         <w:t xml:space="preserve">] [</w:t>
       </w:r>
-      <w:hyperlink r:id="rId39">
+      <w:hyperlink r:id="rId28">
         <w:r>
           <w:rPr>
             <w:rStyle w:val="Hyperlink"/>
@@ -561,7 +575,7 @@
       <w:r>
         <w:t xml:space="preserve">] [</w:t>
       </w:r>
-      <w:hyperlink r:id="rId40">
+      <w:hyperlink r:id="rId29">
         <w:r>
           <w:rPr>
             <w:rStyle w:val="Hyperlink"/>
@@ -575,15 +589,16 @@
     </w:p>
     <w:p>
       <w:pPr>
+        <w:pStyle w:val="Compact"/>
         <w:numPr>
           <w:ilvl w:val="1"/>
           <w:numId w:val="1002"/>
         </w:numPr>
-        <w:pStyle w:val="Compact"/>
       </w:pPr>
       <w:r>
         <w:rPr>
           <w:b/>
+          <w:bCs/>
         </w:rPr>
         <w:t xml:space="preserve">Stefanos Georgiou</w:t>
       </w:r>
@@ -599,7 +614,7 @@
       <w:r>
         <w:t xml:space="preserve">[</w:t>
       </w:r>
-      <w:hyperlink r:id="rId41">
+      <w:hyperlink r:id="rId30">
         <w:r>
           <w:rPr>
             <w:rStyle w:val="Hyperlink"/>
@@ -610,7 +625,7 @@
       <w:r>
         <w:t xml:space="preserve">] [</w:t>
       </w:r>
-      <w:hyperlink r:id="rId42">
+      <w:hyperlink r:id="rId31">
         <w:r>
           <w:rPr>
             <w:rStyle w:val="Hyperlink"/>
@@ -621,7 +636,7 @@
       <w:r>
         <w:t xml:space="preserve">] [</w:t>
       </w:r>
-      <w:hyperlink r:id="rId43">
+      <w:hyperlink r:id="rId32">
         <w:r>
           <w:rPr>
             <w:rStyle w:val="Hyperlink"/>
@@ -632,7 +647,7 @@
       <w:r>
         <w:t xml:space="preserve">] [</w:t>
       </w:r>
-      <w:hyperlink r:id="rId40">
+      <w:hyperlink r:id="rId29">
         <w:r>
           <w:rPr>
             <w:rStyle w:val="Hyperlink"/>
@@ -646,27 +661,28 @@
     </w:p>
     <w:p>
       <w:pPr>
+        <w:pStyle w:val="Compact"/>
         <w:numPr>
           <w:ilvl w:val="0"/>
           <w:numId w:val="1001"/>
         </w:numPr>
+      </w:pPr>
+      <w:r>
+        <w:t xml:space="preserve">Journal Articles</w:t>
+      </w:r>
+    </w:p>
+    <w:p>
+      <w:pPr>
         <w:pStyle w:val="Compact"/>
-      </w:pPr>
-      <w:r>
-        <w:t xml:space="preserve">Journal Articles</w:t>
-      </w:r>
-    </w:p>
-    <w:p>
-      <w:pPr>
         <w:numPr>
           <w:ilvl w:val="1"/>
           <w:numId w:val="1003"/>
         </w:numPr>
-        <w:pStyle w:val="Compact"/>
       </w:pPr>
       <w:r>
         <w:rPr>
           <w:b/>
+          <w:bCs/>
         </w:rPr>
         <w:t xml:space="preserve">Stefanos Georgiou</w:t>
       </w:r>
@@ -676,15 +692,16 @@
     </w:p>
     <w:p>
       <w:pPr>
+        <w:pStyle w:val="Compact"/>
         <w:numPr>
           <w:ilvl w:val="1"/>
           <w:numId w:val="1003"/>
         </w:numPr>
-        <w:pStyle w:val="Compact"/>
       </w:pPr>
       <w:r>
         <w:rPr>
           <w:b/>
+          <w:bCs/>
         </w:rPr>
         <w:t xml:space="preserve">Stefanos Georgiou</w:t>
       </w:r>
@@ -703,7 +720,7 @@
       <w:r>
         <w:t xml:space="preserve">[</w:t>
       </w:r>
-      <w:hyperlink r:id="rId44">
+      <w:hyperlink r:id="rId33">
         <w:r>
           <w:rPr>
             <w:rStyle w:val="Hyperlink"/>
@@ -714,7 +731,7 @@
       <w:r>
         <w:t xml:space="preserve">] [</w:t>
       </w:r>
-      <w:hyperlink r:id="rId45">
+      <w:hyperlink r:id="rId34">
         <w:r>
           <w:rPr>
             <w:rStyle w:val="Hyperlink"/>
@@ -728,15 +745,16 @@
     </w:p>
     <w:p>
       <w:pPr>
+        <w:pStyle w:val="Compact"/>
         <w:numPr>
           <w:ilvl w:val="1"/>
           <w:numId w:val="1003"/>
         </w:numPr>
-        <w:pStyle w:val="Compact"/>
       </w:pPr>
       <w:r>
         <w:rPr>
           <w:b/>
+          <w:bCs/>
         </w:rPr>
         <w:t xml:space="preserve">Stefanos Georgiou</w:t>
       </w:r>
@@ -752,7 +770,7 @@
       <w:r>
         <w:t xml:space="preserve">[</w:t>
       </w:r>
-      <w:hyperlink r:id="rId46">
+      <w:hyperlink r:id="rId35">
         <w:r>
           <w:rPr>
             <w:rStyle w:val="Hyperlink"/>
@@ -763,7 +781,7 @@
       <w:r>
         <w:t xml:space="preserve">] [</w:t>
       </w:r>
-      <w:hyperlink r:id="rId47">
+      <w:hyperlink r:id="rId36">
         <w:r>
           <w:rPr>
             <w:rStyle w:val="Hyperlink"/>
@@ -779,11 +797,11 @@
       <w:pPr>
         <w:pStyle w:val="Heading2"/>
       </w:pPr>
-      <w:bookmarkStart w:id="48" w:name="organization-services"/>
+      <w:bookmarkStart w:id="37" w:name="_e5bd27a4a70528ddbc4c12eea3c9eca69cfa426"/>
       <w:r>
         <w:t xml:space="preserve">Organization Services</w:t>
       </w:r>
-      <w:bookmarkEnd w:id="48"/>
+      <w:bookmarkEnd w:id="37"/>
     </w:p>
     <w:p>
       <w:pPr>
@@ -792,6 +810,7 @@
       <w:r>
         <w:rPr>
           <w:i/>
+          <w:iCs/>
         </w:rPr>
         <w:t xml:space="preserve">Program Committee</w:t>
       </w:r>
@@ -835,6 +854,7 @@
       <w:r>
         <w:rPr>
           <w:i/>
+          <w:iCs/>
         </w:rPr>
         <w:t xml:space="preserve">Reviewer</w:t>
       </w:r>
@@ -870,6 +890,7 @@
       <w:r>
         <w:rPr>
           <w:i/>
+          <w:iCs/>
         </w:rPr>
         <w:t xml:space="preserve">Co-reviewer</w:t>
       </w:r>
@@ -886,11 +907,11 @@
       <w:pPr>
         <w:pStyle w:val="Heading2"/>
       </w:pPr>
-      <w:bookmarkStart w:id="49" w:name="invited-talks"/>
+      <w:bookmarkStart w:id="38" w:name="_d92adb52484a714afc99a8491ccb75f3bf3313e"/>
       <w:r>
         <w:t xml:space="preserve">Invited Talks</w:t>
       </w:r>
-      <w:bookmarkEnd w:id="49"/>
+      <w:bookmarkEnd w:id="38"/>
     </w:p>
     <w:p>
       <w:pPr>
@@ -907,6 +928,7 @@
       <w:r>
         <w:rPr>
           <w:i/>
+          <w:iCs/>
         </w:rPr>
         <w:t xml:space="preserve">How to improve your CI/CD process</w:t>
       </w:r>
@@ -919,7 +941,7 @@
       <w:r>
         <w:t xml:space="preserve"> </w:t>
       </w:r>
-      <w:hyperlink r:id="rId50">
+      <w:hyperlink r:id="rId39">
         <w:r>
           <w:rPr>
             <w:rStyle w:val="Hyperlink"/>
@@ -935,6 +957,7 @@
       <w:r>
         <w:rPr>
           <w:i/>
+          <w:iCs/>
         </w:rPr>
         <w:t xml:space="preserve">Travis CI with CV template tutorial</w:t>
       </w:r>
@@ -947,7 +970,7 @@
       <w:r>
         <w:t xml:space="preserve"> </w:t>
       </w:r>
-      <w:hyperlink r:id="rId51">
+      <w:hyperlink r:id="rId40">
         <w:r>
           <w:rPr>
             <w:rStyle w:val="Hyperlink"/>
@@ -971,6 +994,7 @@
       <w:r>
         <w:rPr>
           <w:i/>
+          <w:iCs/>
         </w:rPr>
         <w:t xml:space="preserve">Saving Energy in Software Development by Making the Right Choices</w:t>
       </w:r>
@@ -983,7 +1007,7 @@
       <w:r>
         <w:t xml:space="preserve"> </w:t>
       </w:r>
-      <w:hyperlink r:id="rId52">
+      <w:hyperlink r:id="rId41">
         <w:r>
           <w:rPr>
             <w:rStyle w:val="Hyperlink"/>
@@ -994,7 +1018,7 @@
       <w:r>
         <w:t xml:space="preserve"> </w:t>
       </w:r>
-      <w:hyperlink r:id="rId53">
+      <w:hyperlink r:id="rId42">
         <w:r>
           <w:rPr>
             <w:rStyle w:val="Hyperlink"/>
@@ -1010,6 +1034,7 @@
       <w:r>
         <w:rPr>
           <w:i/>
+          <w:iCs/>
         </w:rPr>
         <w:t xml:space="preserve">What are your programming language’s energy-delay implications?</w:t>
       </w:r>
@@ -1022,7 +1047,7 @@
       <w:r>
         <w:t xml:space="preserve"> </w:t>
       </w:r>
-      <w:hyperlink r:id="rId54">
+      <w:hyperlink r:id="rId43">
         <w:r>
           <w:rPr>
             <w:rStyle w:val="Hyperlink"/>
@@ -1035,11 +1060,11 @@
       <w:pPr>
         <w:pStyle w:val="Heading2"/>
       </w:pPr>
-      <w:bookmarkStart w:id="55" w:name="teaching-experience"/>
+      <w:bookmarkStart w:id="44" w:name="_6a59066c3a6e5df6600690f250943ddabffdd1a"/>
       <w:r>
         <w:t xml:space="preserve">Teaching Experience</w:t>
       </w:r>
-      <w:bookmarkEnd w:id="55"/>
+      <w:bookmarkEnd w:id="44"/>
     </w:p>
     <w:p>
       <w:pPr>
@@ -1056,7 +1081,7 @@
       <w:r>
         <w:t xml:space="preserve">Assisting my PhD advisor at Programming II course (Winter Semester of 2016, 2017, and 2018) by giving tutorial and Lab sessions in Java [</w:t>
       </w:r>
-      <w:hyperlink r:id="rId56">
+      <w:hyperlink r:id="rId45">
         <w:r>
           <w:rPr>
             <w:rStyle w:val="Hyperlink"/>
@@ -1084,7 +1109,7 @@
       <w:r>
         <w:t xml:space="preserve">[</w:t>
       </w:r>
-      <w:hyperlink r:id="rId57">
+      <w:hyperlink r:id="rId46">
         <w:r>
           <w:rPr>
             <w:rStyle w:val="Hyperlink"/>
@@ -1095,7 +1120,7 @@
       <w:r>
         <w:t xml:space="preserve">] [</w:t>
       </w:r>
-      <w:hyperlink r:id="rId58">
+      <w:hyperlink r:id="rId47">
         <w:r>
           <w:rPr>
             <w:rStyle w:val="Hyperlink"/>
@@ -1111,11 +1136,11 @@
       <w:pPr>
         <w:pStyle w:val="Heading2"/>
       </w:pPr>
-      <w:bookmarkStart w:id="59" w:name="experience-from-industry"/>
+      <w:bookmarkStart w:id="48" w:name="_19125a6dfa17f7c9f0a83fac2de724f5d0850f0"/>
       <w:r>
         <w:t xml:space="preserve">Experience from Industry</w:t>
       </w:r>
-      <w:bookmarkEnd w:id="59"/>
+      <w:bookmarkEnd w:id="48"/>
     </w:p>
     <w:p>
       <w:pPr>
@@ -1132,13 +1157,14 @@
       <w:r>
         <w:rPr>
           <w:b/>
+          <w:bCs/>
         </w:rPr>
         <w:t xml:space="preserve">Back-end developer and DevOps:</w:t>
       </w:r>
       <w:r>
         <w:t xml:space="preserve"> </w:t>
       </w:r>
-      <w:hyperlink r:id="rId60">
+      <w:hyperlink r:id="rId49">
         <w:r>
           <w:rPr>
             <w:rStyle w:val="Hyperlink"/>
@@ -1162,6 +1188,7 @@
       <w:r>
         <w:rPr>
           <w:i/>
+          <w:iCs/>
         </w:rPr>
         <w:t xml:space="preserve">Responsibilities</w:t>
       </w:r>
@@ -1213,13 +1240,14 @@
       <w:r>
         <w:rPr>
           <w:b/>
+          <w:bCs/>
         </w:rPr>
         <w:t xml:space="preserve">Software Developer</w:t>
       </w:r>
       <w:r>
         <w:t xml:space="preserve"> </w:t>
       </w:r>
-      <w:hyperlink r:id="rId61">
+      <w:hyperlink r:id="rId50">
         <w:r>
           <w:rPr>
             <w:rStyle w:val="Hyperlink"/>
@@ -1238,7 +1266,7 @@
       <w:r>
         <w:t xml:space="preserve"> </w:t>
       </w:r>
-      <w:hyperlink r:id="rId62">
+      <w:hyperlink r:id="rId51">
         <w:r>
           <w:rPr>
             <w:rStyle w:val="Hyperlink"/>
@@ -1249,7 +1277,7 @@
       <w:r>
         <w:t xml:space="preserve"> </w:t>
       </w:r>
-      <w:hyperlink r:id="rId63">
+      <w:hyperlink r:id="rId52">
         <w:r>
           <w:rPr>
             <w:rStyle w:val="Hyperlink"/>
@@ -1265,6 +1293,7 @@
       <w:r>
         <w:rPr>
           <w:i/>
+          <w:iCs/>
         </w:rPr>
         <w:t xml:space="preserve">Responsibilities</w:t>
       </w:r>
@@ -1279,7 +1308,7 @@
       <w:r>
         <w:t xml:space="preserve"> </w:t>
       </w:r>
-      <w:hyperlink r:id="rId64">
+      <w:hyperlink r:id="rId53">
         <w:r>
           <w:rPr>
             <w:rStyle w:val="Hyperlink"/>
@@ -1293,7 +1322,7 @@
       <w:r>
         <w:t xml:space="preserve"> </w:t>
       </w:r>
-      <w:hyperlink r:id="rId65">
+      <w:hyperlink r:id="rId54">
         <w:r>
           <w:rPr>
             <w:rStyle w:val="Hyperlink"/>
@@ -1307,7 +1336,7 @@
       <w:r>
         <w:t xml:space="preserve"> </w:t>
       </w:r>
-      <w:hyperlink r:id="rId66">
+      <w:hyperlink r:id="rId55">
         <w:r>
           <w:rPr>
             <w:rStyle w:val="Hyperlink"/>
@@ -1345,13 +1374,14 @@
       <w:r>
         <w:rPr>
           <w:b/>
+          <w:bCs/>
         </w:rPr>
         <w:t xml:space="preserve">Back-end developer, DevOps, and Integrations:</w:t>
       </w:r>
       <w:r>
         <w:t xml:space="preserve"> </w:t>
       </w:r>
-      <w:hyperlink r:id="rId67">
+      <w:hyperlink r:id="rId56">
         <w:r>
           <w:rPr>
             <w:rStyle w:val="Hyperlink"/>
@@ -1370,7 +1400,7 @@
       <w:r>
         <w:t xml:space="preserve"> </w:t>
       </w:r>
-      <w:hyperlink r:id="rId68">
+      <w:hyperlink r:id="rId57">
         <w:r>
           <w:rPr>
             <w:rStyle w:val="Hyperlink"/>
@@ -1389,6 +1419,7 @@
       <w:r>
         <w:rPr>
           <w:i/>
+          <w:iCs/>
         </w:rPr>
         <w:t xml:space="preserve">Responsibilities</w:t>
       </w:r>
@@ -1400,7 +1431,7 @@
       <w:r>
         <w:t xml:space="preserve">Development of API end-points in JavaScript (</w:t>
       </w:r>
-      <w:hyperlink r:id="rId69">
+      <w:hyperlink r:id="rId58">
         <w:r>
           <w:rPr>
             <w:rStyle w:val="Hyperlink"/>
@@ -1414,7 +1445,7 @@
       <w:r>
         <w:t xml:space="preserve"> </w:t>
       </w:r>
-      <w:hyperlink r:id="rId70">
+      <w:hyperlink r:id="rId59">
         <w:r>
           <w:rPr>
             <w:rStyle w:val="Hyperlink"/>
@@ -1439,7 +1470,7 @@
       <w:r>
         <w:t xml:space="preserve"> </w:t>
       </w:r>
-      <w:hyperlink r:id="rId71">
+      <w:hyperlink r:id="rId60">
         <w:r>
           <w:rPr>
             <w:rStyle w:val="Hyperlink"/>
@@ -1456,7 +1487,7 @@
       <w:r>
         <w:t xml:space="preserve"> </w:t>
       </w:r>
-      <w:hyperlink r:id="rId72">
+      <w:hyperlink r:id="rId61">
         <w:r>
           <w:rPr>
             <w:rStyle w:val="Hyperlink"/>
@@ -1473,7 +1504,7 @@
       <w:r>
         <w:t xml:space="preserve"> </w:t>
       </w:r>
-      <w:hyperlink r:id="rId73">
+      <w:hyperlink r:id="rId62">
         <w:r>
           <w:rPr>
             <w:rStyle w:val="Hyperlink"/>
@@ -1492,7 +1523,7 @@
       <w:r>
         <w:t xml:space="preserve"> </w:t>
       </w:r>
-      <w:hyperlink r:id="rId74">
+      <w:hyperlink r:id="rId63">
         <w:r>
           <w:rPr>
             <w:rStyle w:val="Hyperlink"/>
@@ -1506,7 +1537,7 @@
       <w:r>
         <w:t xml:space="preserve"> </w:t>
       </w:r>
-      <w:hyperlink r:id="rId75">
+      <w:hyperlink r:id="rId64">
         <w:r>
           <w:rPr>
             <w:rStyle w:val="Hyperlink"/>
@@ -1520,7 +1551,7 @@
       <w:r>
         <w:t xml:space="preserve"> </w:t>
       </w:r>
-      <w:hyperlink r:id="rId76">
+      <w:hyperlink r:id="rId65">
         <w:r>
           <w:rPr>
             <w:rStyle w:val="Hyperlink"/>
@@ -1539,7 +1570,7 @@
       <w:r>
         <w:t xml:space="preserve"> </w:t>
       </w:r>
-      <w:hyperlink r:id="rId77">
+      <w:hyperlink r:id="rId66">
         <w:r>
           <w:rPr>
             <w:rStyle w:val="Hyperlink"/>
@@ -1556,7 +1587,7 @@
       <w:r>
         <w:t xml:space="preserve"> </w:t>
       </w:r>
-      <w:hyperlink r:id="rId78">
+      <w:hyperlink r:id="rId67">
         <w:r>
           <w:rPr>
             <w:rStyle w:val="Hyperlink"/>
@@ -1586,13 +1617,14 @@
       <w:r>
         <w:rPr>
           <w:b/>
+          <w:bCs/>
         </w:rPr>
         <w:t xml:space="preserve">Proposals writing:</w:t>
       </w:r>
       <w:r>
         <w:t xml:space="preserve"> </w:t>
       </w:r>
-      <w:hyperlink r:id="rId79">
+      <w:hyperlink r:id="rId68">
         <w:r>
           <w:rPr>
             <w:rStyle w:val="Hyperlink"/>
@@ -1611,7 +1643,7 @@
       <w:r>
         <w:t xml:space="preserve"> </w:t>
       </w:r>
-      <w:hyperlink r:id="rId80">
+      <w:hyperlink r:id="rId69">
         <w:r>
           <w:rPr>
             <w:rStyle w:val="Hyperlink"/>
@@ -1627,6 +1659,7 @@
       <w:r>
         <w:rPr>
           <w:i/>
+          <w:iCs/>
         </w:rPr>
         <w:t xml:space="preserve">Responsibilities</w:t>
       </w:r>
@@ -1643,11 +1676,11 @@
       <w:pPr>
         <w:pStyle w:val="Heading2"/>
       </w:pPr>
-      <w:bookmarkStart w:id="81" w:name="technical-experience"/>
+      <w:bookmarkStart w:id="70" w:name="_c46085cd9320c602ce9f94f7c37977e4fcc24d2"/>
       <w:r>
         <w:t xml:space="preserve">Technical Experience</w:t>
       </w:r>
-      <w:bookmarkEnd w:id="81"/>
+      <w:bookmarkEnd w:id="70"/>
     </w:p>
     <w:p>
       <w:pPr>
@@ -1656,6 +1689,7 @@
       <w:r>
         <w:rPr>
           <w:i/>
+          <w:iCs/>
         </w:rPr>
         <w:t xml:space="preserve">Back-End</w:t>
       </w:r>
@@ -1715,7 +1749,7 @@
       <w:r>
         <w:t xml:space="preserve">MongoDB (</w:t>
       </w:r>
-      <w:hyperlink r:id="rId82">
+      <w:hyperlink r:id="rId71">
         <w:r>
           <w:rPr>
             <w:rStyle w:val="Hyperlink"/>
@@ -1729,7 +1763,7 @@
       <w:r>
         <w:t xml:space="preserve"> </w:t>
       </w:r>
-      <w:hyperlink r:id="rId83">
+      <w:hyperlink r:id="rId72">
         <w:r>
           <w:rPr>
             <w:rStyle w:val="Hyperlink"/>
@@ -1743,7 +1777,7 @@
       <w:r>
         <w:t xml:space="preserve"> </w:t>
       </w:r>
-      <w:hyperlink r:id="rId84">
+      <w:hyperlink r:id="rId73">
         <w:r>
           <w:rPr>
             <w:rStyle w:val="Hyperlink"/>
@@ -1757,7 +1791,7 @@
       <w:r>
         <w:t xml:space="preserve"> </w:t>
       </w:r>
-      <w:hyperlink r:id="rId85">
+      <w:hyperlink r:id="rId74">
         <w:r>
           <w:rPr>
             <w:rStyle w:val="Hyperlink"/>
@@ -1776,6 +1810,7 @@
       <w:r>
         <w:rPr>
           <w:i/>
+          <w:iCs/>
         </w:rPr>
         <w:t xml:space="preserve">DevOps</w:t>
       </w:r>
@@ -1827,6 +1862,7 @@
       <w:r>
         <w:rPr>
           <w:i/>
+          <w:iCs/>
         </w:rPr>
         <w:t xml:space="preserve">Projects</w:t>
       </w:r>
@@ -1841,7 +1877,7 @@
       <w:r>
         <w:t xml:space="preserve"> </w:t>
       </w:r>
-      <w:hyperlink r:id="rId86">
+      <w:hyperlink r:id="rId75">
         <w:r>
           <w:rPr>
             <w:rStyle w:val="Hyperlink"/>
@@ -1860,7 +1896,7 @@
       <w:r>
         <w:t xml:space="preserve"> </w:t>
       </w:r>
-      <w:hyperlink r:id="rId87">
+      <w:hyperlink r:id="rId76">
         <w:r>
           <w:rPr>
             <w:rStyle w:val="Hyperlink"/>
@@ -1879,7 +1915,7 @@
       <w:r>
         <w:t xml:space="preserve"> </w:t>
       </w:r>
-      <w:hyperlink r:id="rId88">
+      <w:hyperlink r:id="rId77">
         <w:r>
           <w:rPr>
             <w:rStyle w:val="Hyperlink"/>
@@ -1896,7 +1932,7 @@
       <w:r>
         <w:t xml:space="preserve"> </w:t>
       </w:r>
-      <w:hyperlink r:id="rId89">
+      <w:hyperlink r:id="rId78">
         <w:r>
           <w:rPr>
             <w:rStyle w:val="Hyperlink"/>
@@ -1921,7 +1957,7 @@
       <w:r>
         <w:t xml:space="preserve"> </w:t>
       </w:r>
-      <w:hyperlink r:id="rId90">
+      <w:hyperlink r:id="rId79">
         <w:r>
           <w:rPr>
             <w:rStyle w:val="Hyperlink"/>
@@ -1940,7 +1976,7 @@
       <w:r>
         <w:t xml:space="preserve"> </w:t>
       </w:r>
-      <w:hyperlink r:id="rId40">
+      <w:hyperlink r:id="rId29">
         <w:r>
           <w:rPr>
             <w:rStyle w:val="Hyperlink"/>
@@ -1959,7 +1995,7 @@
       <w:r>
         <w:t xml:space="preserve"> </w:t>
       </w:r>
-      <w:hyperlink r:id="rId91">
+      <w:hyperlink r:id="rId80">
         <w:r>
           <w:rPr>
             <w:rStyle w:val="Hyperlink"/>
@@ -1975,6 +2011,7 @@
       <w:r>
         <w:rPr>
           <w:i/>
+          <w:iCs/>
         </w:rPr>
         <w:t xml:space="preserve">Certificates</w:t>
       </w:r>
@@ -1989,7 +2026,7 @@
       <w:r>
         <w:t xml:space="preserve"> </w:t>
       </w:r>
-      <w:hyperlink r:id="rId92">
+      <w:hyperlink r:id="rId81">
         <w:r>
           <w:rPr>
             <w:rStyle w:val="Hyperlink"/>
@@ -2005,6 +2042,7 @@
       <w:r>
         <w:rPr>
           <w:i/>
+          <w:iCs/>
         </w:rPr>
         <w:t xml:space="preserve">Course Completion</w:t>
       </w:r>
@@ -2019,7 +2057,7 @@
       <w:r>
         <w:t xml:space="preserve"> </w:t>
       </w:r>
-      <w:hyperlink r:id="rId93">
+      <w:hyperlink r:id="rId82">
         <w:r>
           <w:rPr>
             <w:rStyle w:val="Hyperlink"/>
@@ -2033,7 +2071,7 @@
       <w:r>
         <w:t xml:space="preserve"> </w:t>
       </w:r>
-      <w:hyperlink r:id="rId83">
+      <w:hyperlink r:id="rId72">
         <w:r>
           <w:rPr>
             <w:rStyle w:val="Hyperlink"/>
@@ -2047,7 +2085,7 @@
       <w:r>
         <w:t xml:space="preserve"> </w:t>
       </w:r>
-      <w:hyperlink r:id="rId84">
+      <w:hyperlink r:id="rId73">
         <w:r>
           <w:rPr>
             <w:rStyle w:val="Hyperlink"/>
@@ -2061,7 +2099,7 @@
       <w:r>
         <w:t xml:space="preserve"> </w:t>
       </w:r>
-      <w:hyperlink r:id="rId85">
+      <w:hyperlink r:id="rId74">
         <w:r>
           <w:rPr>
             <w:rStyle w:val="Hyperlink"/>
@@ -2090,262 +2128,262 @@
       <w:pPr>
         <w:pStyle w:val="Heading2"/>
       </w:pPr>
-      <w:bookmarkStart w:id="94" w:name="X9be22b774a5c8db00a5c7e861fb8f8ad2904c89"/>
+      <w:bookmarkStart w:id="83" w:name="_9be22b774a5c8db00a5c7e861fb8f8ad2904c89"/>
       <w:r>
         <w:t xml:space="preserve">Grands, Awards, Achievements, Languages, and Living Abroad</w:t>
       </w:r>
-      <w:bookmarkEnd w:id="94"/>
-    </w:p>
-    <w:p>
-      <w:pPr>
+      <w:bookmarkEnd w:id="83"/>
+    </w:p>
+    <w:p>
+      <w:pPr>
+        <w:pStyle w:val="Compact"/>
         <w:numPr>
           <w:ilvl w:val="0"/>
           <w:numId w:val="1004"/>
         </w:numPr>
+      </w:pPr>
+      <w:r>
+        <w:t xml:space="preserve">Grands and awards:</w:t>
+      </w:r>
+    </w:p>
+    <w:p>
+      <w:pPr>
         <w:pStyle w:val="Compact"/>
-      </w:pPr>
-      <w:r>
-        <w:t xml:space="preserve">Grands and awards:</w:t>
-      </w:r>
-    </w:p>
-    <w:p>
-      <w:pPr>
         <w:numPr>
           <w:ilvl w:val="1"/>
           <w:numId w:val="1005"/>
         </w:numPr>
+      </w:pPr>
+      <w:hyperlink r:id="rId84">
+        <w:r>
+          <w:rPr>
+            <w:rStyle w:val="Hyperlink"/>
+          </w:rPr>
+          <w:t xml:space="preserve">Arctic Code Vault Contributor</w:t>
+        </w:r>
+      </w:hyperlink>
+    </w:p>
+    <w:p>
+      <w:pPr>
         <w:pStyle w:val="Compact"/>
-      </w:pPr>
-      <w:hyperlink r:id="rId95">
-        <w:r>
-          <w:rPr>
-            <w:rStyle w:val="Hyperlink"/>
-          </w:rPr>
-          <w:t xml:space="preserve">Arctic Code Vault Contributor</w:t>
-        </w:r>
-      </w:hyperlink>
-    </w:p>
-    <w:p>
-      <w:pPr>
         <w:numPr>
           <w:ilvl w:val="1"/>
           <w:numId w:val="1005"/>
         </w:numPr>
+      </w:pPr>
+      <w:r>
+        <w:t xml:space="preserve">Mentored younger researcher</w:t>
+      </w:r>
+      <w:r>
+        <w:t xml:space="preserve"> </w:t>
+      </w:r>
+      <w:hyperlink r:id="rId85">
+        <w:r>
+          <w:rPr>
+            <w:rStyle w:val="Hyperlink"/>
+          </w:rPr>
+          <w:t xml:space="preserve">who won 2nd place</w:t>
+        </w:r>
+      </w:hyperlink>
+      <w:r>
+        <w:t xml:space="preserve"> </w:t>
+      </w:r>
+      <w:r>
+        <w:t xml:space="preserve">in SRC ESEC/FSE ’19.</w:t>
+      </w:r>
+    </w:p>
+    <w:p>
+      <w:pPr>
         <w:pStyle w:val="Compact"/>
-      </w:pPr>
-      <w:r>
-        <w:t xml:space="preserve">Mentored younger researcher</w:t>
-      </w:r>
-      <w:r>
-        <w:t xml:space="preserve"> </w:t>
-      </w:r>
-      <w:hyperlink r:id="rId96">
-        <w:r>
-          <w:rPr>
-            <w:rStyle w:val="Hyperlink"/>
-          </w:rPr>
-          <w:t xml:space="preserve">who won 2nd place</w:t>
-        </w:r>
-      </w:hyperlink>
-      <w:r>
-        <w:t xml:space="preserve"> </w:t>
-      </w:r>
-      <w:r>
-        <w:t xml:space="preserve">in SRC ESEC/FSE ’19.</w:t>
-      </w:r>
-    </w:p>
-    <w:p>
-      <w:pPr>
         <w:numPr>
           <w:ilvl w:val="1"/>
           <w:numId w:val="1005"/>
         </w:numPr>
+      </w:pPr>
+      <w:r>
+        <w:t xml:space="preserve">Best paper award from the 15th Annual DMST Student Conference (2018)</w:t>
+      </w:r>
+    </w:p>
+    <w:p>
+      <w:pPr>
         <w:pStyle w:val="Compact"/>
-      </w:pPr>
-      <w:r>
-        <w:t xml:space="preserve">Best paper award from the 15th Annual DMST Student Conference (2018)</w:t>
-      </w:r>
-    </w:p>
-    <w:p>
-      <w:pPr>
         <w:numPr>
           <w:ilvl w:val="1"/>
           <w:numId w:val="1005"/>
         </w:numPr>
+      </w:pPr>
+      <w:r>
+        <w:t xml:space="preserve">Marie Skłodowska-Curie funds,</w:t>
+      </w:r>
+      <w:r>
+        <w:t xml:space="preserve"> </w:t>
+      </w:r>
+      <w:hyperlink r:id="rId86">
+        <w:r>
+          <w:rPr>
+            <w:rStyle w:val="Hyperlink"/>
+          </w:rPr>
+          <w:t xml:space="preserve">SENECA</w:t>
+        </w:r>
+      </w:hyperlink>
+      <w:r>
+        <w:t xml:space="preserve"> </w:t>
+      </w:r>
+      <w:r>
+        <w:t xml:space="preserve">(2016-2019)</w:t>
+      </w:r>
+    </w:p>
+    <w:p>
+      <w:pPr>
         <w:pStyle w:val="Compact"/>
-      </w:pPr>
-      <w:r>
-        <w:t xml:space="preserve">Marie Skłodowska-Curie funds,</w:t>
-      </w:r>
-      <w:r>
-        <w:t xml:space="preserve"> </w:t>
-      </w:r>
-      <w:hyperlink r:id="rId97">
-        <w:r>
-          <w:rPr>
-            <w:rStyle w:val="Hyperlink"/>
-          </w:rPr>
-          <w:t xml:space="preserve">SENECA</w:t>
-        </w:r>
-      </w:hyperlink>
-      <w:r>
-        <w:t xml:space="preserve"> </w:t>
-      </w:r>
-      <w:r>
-        <w:t xml:space="preserve">(2016-2019)</w:t>
-      </w:r>
-    </w:p>
-    <w:p>
-      <w:pPr>
         <w:numPr>
           <w:ilvl w:val="1"/>
           <w:numId w:val="1005"/>
         </w:numPr>
+      </w:pPr>
+      <w:r>
+        <w:t xml:space="preserve">Erasmus Mundus Masters Scholarship, PERCCOM (2013-2015)</w:t>
+      </w:r>
+    </w:p>
+    <w:p>
+      <w:pPr>
         <w:pStyle w:val="Compact"/>
-      </w:pPr>
-      <w:r>
-        <w:t xml:space="preserve">Erasmus Mundus Masters Scholarship, PERCCOM (2013-2015)</w:t>
-      </w:r>
-    </w:p>
-    <w:p>
-      <w:pPr>
         <w:numPr>
           <w:ilvl w:val="0"/>
           <w:numId w:val="1004"/>
         </w:numPr>
+      </w:pPr>
+      <w:r>
+        <w:t xml:space="preserve">Human Languages:</w:t>
+      </w:r>
+    </w:p>
+    <w:p>
+      <w:pPr>
         <w:pStyle w:val="Compact"/>
-      </w:pPr>
-      <w:r>
-        <w:t xml:space="preserve">Human Languages:</w:t>
-      </w:r>
-    </w:p>
-    <w:p>
-      <w:pPr>
         <w:numPr>
           <w:ilvl w:val="1"/>
           <w:numId w:val="1006"/>
         </w:numPr>
+      </w:pPr>
+      <w:r>
+        <w:t xml:space="preserve">Greek/Hungarian (Native speaker)</w:t>
+      </w:r>
+    </w:p>
+    <w:p>
+      <w:pPr>
         <w:pStyle w:val="Compact"/>
-      </w:pPr>
-      <w:r>
-        <w:t xml:space="preserve">Greek/Hungarian (Native speaker)</w:t>
-      </w:r>
-    </w:p>
-    <w:p>
-      <w:pPr>
         <w:numPr>
           <w:ilvl w:val="1"/>
           <w:numId w:val="1006"/>
         </w:numPr>
+      </w:pPr>
+      <w:r>
+        <w:t xml:space="preserve">English (Fluent speaker)</w:t>
+      </w:r>
+    </w:p>
+    <w:p>
+      <w:pPr>
         <w:pStyle w:val="Compact"/>
-      </w:pPr>
-      <w:r>
-        <w:t xml:space="preserve">English (Fluent speaker)</w:t>
-      </w:r>
-    </w:p>
-    <w:p>
-      <w:pPr>
         <w:numPr>
           <w:ilvl w:val="1"/>
           <w:numId w:val="1006"/>
         </w:numPr>
+      </w:pPr>
+      <w:r>
+        <w:t xml:space="preserve">Russian/France (Basic knowledge)</w:t>
+      </w:r>
+    </w:p>
+    <w:p>
+      <w:pPr>
         <w:pStyle w:val="Compact"/>
-      </w:pPr>
-      <w:r>
-        <w:t xml:space="preserve">Russian/France (Basic knowledge)</w:t>
-      </w:r>
-    </w:p>
-    <w:p>
-      <w:pPr>
         <w:numPr>
           <w:ilvl w:val="0"/>
           <w:numId w:val="1004"/>
         </w:numPr>
+      </w:pPr>
+      <w:r>
+        <w:t xml:space="preserve">Living Abroad:</w:t>
+      </w:r>
+    </w:p>
+    <w:p>
+      <w:pPr>
         <w:pStyle w:val="Compact"/>
-      </w:pPr>
-      <w:r>
-        <w:t xml:space="preserve">Living Abroad:</w:t>
-      </w:r>
-    </w:p>
-    <w:p>
-      <w:pPr>
         <w:numPr>
           <w:ilvl w:val="1"/>
           <w:numId w:val="1007"/>
         </w:numPr>
+      </w:pPr>
+      <w:r>
+        <w:t xml:space="preserve">Born in Gyula, Hungary but grown up in Nicosia, Cyprus.</w:t>
+      </w:r>
+    </w:p>
+    <w:p>
+      <w:pPr>
         <w:pStyle w:val="Compact"/>
-      </w:pPr>
-      <w:r>
-        <w:t xml:space="preserve">Born in Gyula, Hungary but grown up in Nicosia, Cyprus.</w:t>
-      </w:r>
-    </w:p>
-    <w:p>
-      <w:pPr>
         <w:numPr>
           <w:ilvl w:val="1"/>
           <w:numId w:val="1007"/>
         </w:numPr>
+      </w:pPr>
+      <w:r>
+        <w:t xml:space="preserve">Ate baguettes and drunk wine in Lorraine, France (Fall Semester of 2013)</w:t>
+      </w:r>
+    </w:p>
+    <w:p>
+      <w:pPr>
         <w:pStyle w:val="Compact"/>
-      </w:pPr>
-      <w:r>
-        <w:t xml:space="preserve">Ate baguettes and drunk wine in Lorraine, France (Fall Semester of 2013)</w:t>
-      </w:r>
-    </w:p>
-    <w:p>
-      <w:pPr>
         <w:numPr>
           <w:ilvl w:val="1"/>
           <w:numId w:val="1007"/>
         </w:numPr>
+      </w:pPr>
+      <w:r>
+        <w:t xml:space="preserve">Attended to many sauna parties in Lappeenranta, Finland (Spring Semester of 2014)</w:t>
+      </w:r>
+    </w:p>
+    <w:p>
+      <w:pPr>
         <w:pStyle w:val="Compact"/>
-      </w:pPr>
-      <w:r>
-        <w:t xml:space="preserve">Attended to many sauna parties in Lappeenranta, Finland (Spring Semester of 2014)</w:t>
-      </w:r>
-    </w:p>
-    <w:p>
-      <w:pPr>
         <w:numPr>
           <w:ilvl w:val="1"/>
           <w:numId w:val="1007"/>
         </w:numPr>
+      </w:pPr>
+      <w:r>
+        <w:t xml:space="preserve">Fish ice-cold beers from lakes in Lulea, Sweden (Fall Semeseter of 2014)</w:t>
+      </w:r>
+    </w:p>
+    <w:p>
+      <w:pPr>
         <w:pStyle w:val="Compact"/>
-      </w:pPr>
-      <w:r>
-        <w:t xml:space="preserve">Fish ice-cold beers from lakes in Lulea, Sweden (Fall Semeseter of 2014)</w:t>
-      </w:r>
-    </w:p>
-    <w:p>
-      <w:pPr>
         <w:numPr>
           <w:ilvl w:val="1"/>
           <w:numId w:val="1007"/>
         </w:numPr>
+      </w:pPr>
+      <w:r>
+        <w:t xml:space="preserve">Drunk vodka and ate borsh in Saint-Petersburg, Russia (Spring Semester of 2015)</w:t>
+      </w:r>
+    </w:p>
+    <w:p>
+      <w:pPr>
         <w:pStyle w:val="Compact"/>
-      </w:pPr>
-      <w:r>
-        <w:t xml:space="preserve">Drunk vodka and ate borsh in Saint-Petersburg, Russia (Spring Semester of 2015)</w:t>
-      </w:r>
-    </w:p>
-    <w:p>
-      <w:pPr>
         <w:numPr>
           <w:ilvl w:val="1"/>
           <w:numId w:val="1007"/>
         </w:numPr>
+      </w:pPr>
+      <w:r>
+        <w:t xml:space="preserve">Teaching in Athens and visiting islands in Greece (Fall Semester of 2016 till now)</w:t>
+      </w:r>
+    </w:p>
+    <w:p>
+      <w:pPr>
         <w:pStyle w:val="Compact"/>
-      </w:pPr>
-      <w:r>
-        <w:t xml:space="preserve">Teaching in Athens and visiting islands in Greece (Fall Semester of 2016 till now)</w:t>
-      </w:r>
-    </w:p>
-    <w:p>
-      <w:pPr>
         <w:numPr>
           <w:ilvl w:val="1"/>
           <w:numId w:val="1007"/>
         </w:numPr>
-        <w:pStyle w:val="Compact"/>
       </w:pPr>
       <w:r>
         <w:t xml:space="preserve">Biked in Delft, the Netherlands for my PhD secondment (Half month of Sept. 2017)</w:t>
@@ -2355,11 +2393,11 @@
       <w:pPr>
         <w:pStyle w:val="Heading2"/>
       </w:pPr>
-      <w:bookmarkStart w:id="98" w:name="my-academic-genealogy-tree"/>
+      <w:bookmarkStart w:id="87" w:name="_831f2f1a4d8d04485c34fb194a5805b92e9efdb"/>
       <w:r>
         <w:t xml:space="preserve">My Academic Genealogy Tree</w:t>
       </w:r>
-      <w:bookmarkEnd w:id="98"/>
+      <w:bookmarkEnd w:id="87"/>
     </w:p>
     <w:p>
       <w:pPr>
@@ -2381,7 +2419,11 @@
         </w:pict>
       </w:r>
     </w:p>
-    <w:sectPr/>
+    <w:sectPr>
+      <w:footnotePr>
+        <w:numRestart w:val="eachSect"/>
+      </w:footnotePr>
+    </w:sectPr>
   </w:body>
 </w:document>
 </file>
@@ -2412,17 +2454,14 @@
 <file path=word/numbering.xml><?xml version="1.0" encoding="utf-8"?>
 <w:numbering xmlns:w="http://schemas.openxmlformats.org/wordprocessingml/2006/main">
   <w:abstractNum w:abstractNumId="990">
-    <w:nsid w:val="2c1ae401"/>
+    <w:nsid w:val="0000A990"/>
     <w:multiLevelType w:val="multilevel"/>
     <w:lvl w:ilvl="0">
       <w:numFmt w:val="bullet"/>
       <w:lvlText w:val=" "/>
       <w:lvlJc w:val="left"/>
       <w:pPr>
-        <w:tabs>
-          <w:tab w:val="num" w:pos="0"/>
-        </w:tabs>
-        <w:ind w:left="480" w:hanging="480"/>
+        <w:ind w:left="720" w:hanging="360"/>
       </w:pPr>
     </w:lvl>
     <w:lvl w:ilvl="1">
@@ -2430,10 +2469,7 @@
       <w:lvlText w:val=" "/>
       <w:lvlJc w:val="left"/>
       <w:pPr>
-        <w:tabs>
-          <w:tab w:val="num" w:pos="720"/>
-        </w:tabs>
-        <w:ind w:left="1200" w:hanging="480"/>
+        <w:ind w:left="1440" w:hanging="360"/>
       </w:pPr>
     </w:lvl>
     <w:lvl w:ilvl="2">
@@ -2441,10 +2477,7 @@
       <w:lvlText w:val=" "/>
       <w:lvlJc w:val="left"/>
       <w:pPr>
-        <w:tabs>
-          <w:tab w:val="num" w:pos="1440"/>
-        </w:tabs>
-        <w:ind w:left="1920" w:hanging="480"/>
+        <w:ind w:left="2160" w:hanging="360"/>
       </w:pPr>
     </w:lvl>
     <w:lvl w:ilvl="3">
@@ -2452,10 +2485,7 @@
       <w:lvlText w:val=" "/>
       <w:lvlJc w:val="left"/>
       <w:pPr>
-        <w:tabs>
-          <w:tab w:val="num" w:pos="2160"/>
-        </w:tabs>
-        <w:ind w:left="2640" w:hanging="480"/>
+        <w:ind w:left="2880" w:hanging="360"/>
       </w:pPr>
     </w:lvl>
     <w:lvl w:ilvl="4">
@@ -2463,10 +2493,7 @@
       <w:lvlText w:val=" "/>
       <w:lvlJc w:val="left"/>
       <w:pPr>
-        <w:tabs>
-          <w:tab w:val="num" w:pos="2880"/>
-        </w:tabs>
-        <w:ind w:left="3360" w:hanging="480"/>
+        <w:ind w:left="3600" w:hanging="360"/>
       </w:pPr>
     </w:lvl>
     <w:lvl w:ilvl="5">
@@ -2474,10 +2501,7 @@
       <w:lvlText w:val=" "/>
       <w:lvlJc w:val="left"/>
       <w:pPr>
-        <w:tabs>
-          <w:tab w:val="num" w:pos="3600"/>
-        </w:tabs>
-        <w:ind w:left="4080" w:hanging="480"/>
+        <w:ind w:left="4320" w:hanging="360"/>
       </w:pPr>
     </w:lvl>
     <w:lvl w:ilvl="6">
@@ -2485,10 +2509,7 @@
       <w:lvlText w:val=" "/>
       <w:lvlJc w:val="left"/>
       <w:pPr>
-        <w:tabs>
-          <w:tab w:val="num" w:pos="4320"/>
-        </w:tabs>
-        <w:ind w:left="4800" w:hanging="480"/>
+        <w:ind w:left="5040" w:hanging="360"/>
       </w:pPr>
     </w:lvl>
     <w:lvl w:ilvl="7">
@@ -2496,10 +2517,7 @@
       <w:lvlText w:val=" "/>
       <w:lvlJc w:val="left"/>
       <w:pPr>
-        <w:tabs>
-          <w:tab w:val="num" w:pos="5040"/>
-        </w:tabs>
-        <w:ind w:left="5520" w:hanging="480"/>
+        <w:ind w:left="5760" w:hanging="360"/>
       </w:pPr>
     </w:lvl>
     <w:lvl w:ilvl="8">
@@ -2507,114 +2525,111 @@
       <w:lvlText w:val=" "/>
       <w:lvlJc w:val="left"/>
       <w:pPr>
-        <w:tabs>
-          <w:tab w:val="num" w:pos="5760"/>
-        </w:tabs>
-        <w:ind w:left="6240" w:hanging="480"/>
+        <w:ind w:left="6480" w:hanging="360"/>
       </w:pPr>
     </w:lvl>
   </w:abstractNum>
   <w:abstractNum w:abstractNumId="991">
-    <w:nsid w:val="ea454b4c"/>
+    <w:nsid w:val="0000A991"/>
     <w:multiLevelType w:val="multilevel"/>
     <w:lvl w:ilvl="0">
       <w:numFmt w:val="bullet"/>
-      <w:lvlText w:val="•"/>
+      <w:lvlText w:val=""/>
       <w:lvlJc w:val="left"/>
       <w:pPr>
-        <w:tabs>
-          <w:tab w:val="num" w:pos="0"/>
-        </w:tabs>
-        <w:ind w:left="480" w:hanging="480"/>
-      </w:pPr>
+        <w:ind w:left="720" w:hanging="360"/>
+      </w:pPr>
+      <w:rPr>
+        <w:rFonts w:ascii="Symbol" w:hAnsi="Symbol" w:cs="Symbol" w:hint="default"/>
+      </w:rPr>
     </w:lvl>
     <w:lvl w:ilvl="1">
       <w:numFmt w:val="bullet"/>
-      <w:lvlText w:val="–"/>
+      <w:lvlText w:val="o"/>
       <w:lvlJc w:val="left"/>
       <w:pPr>
-        <w:tabs>
-          <w:tab w:val="num" w:pos="720"/>
-        </w:tabs>
-        <w:ind w:left="1200" w:hanging="480"/>
-      </w:pPr>
+        <w:ind w:left="1440" w:hanging="360"/>
+      </w:pPr>
+      <w:rPr>
+        <w:rFonts w:ascii="Courier New" w:hAnsi="Courier New" w:cs="Courier New" w:hint="default"/>
+      </w:rPr>
     </w:lvl>
     <w:lvl w:ilvl="2">
       <w:numFmt w:val="bullet"/>
-      <w:lvlText w:val="•"/>
+      <w:lvlText w:val=""/>
       <w:lvlJc w:val="left"/>
       <w:pPr>
-        <w:tabs>
-          <w:tab w:val="num" w:pos="1440"/>
-        </w:tabs>
-        <w:ind w:left="1920" w:hanging="480"/>
-      </w:pPr>
+        <w:ind w:left="2160" w:hanging="360"/>
+      </w:pPr>
+      <w:rPr>
+        <w:rFonts w:ascii="Wingdings" w:hAnsi="Wingdings" w:cs="Wingdings" w:hint="default"/>
+      </w:rPr>
     </w:lvl>
     <w:lvl w:ilvl="3">
       <w:numFmt w:val="bullet"/>
-      <w:lvlText w:val="–"/>
+      <w:lvlText w:val=""/>
       <w:lvlJc w:val="left"/>
       <w:pPr>
-        <w:tabs>
-          <w:tab w:val="num" w:pos="2160"/>
-        </w:tabs>
-        <w:ind w:left="2640" w:hanging="480"/>
-      </w:pPr>
+        <w:ind w:left="2880" w:hanging="360"/>
+      </w:pPr>
+      <w:rPr>
+        <w:rFonts w:ascii="Symbol" w:hAnsi="Symbol" w:cs="Symbol" w:hint="default"/>
+      </w:rPr>
     </w:lvl>
     <w:lvl w:ilvl="4">
       <w:numFmt w:val="bullet"/>
-      <w:lvlText w:val="•"/>
+      <w:lvlText w:val="o"/>
       <w:lvlJc w:val="left"/>
       <w:pPr>
-        <w:tabs>
-          <w:tab w:val="num" w:pos="2880"/>
-        </w:tabs>
-        <w:ind w:left="3360" w:hanging="480"/>
-      </w:pPr>
+        <w:ind w:left="3600" w:hanging="360"/>
+      </w:pPr>
+      <w:rPr>
+        <w:rFonts w:ascii="Courier New" w:hAnsi="Courier New" w:cs="Courier New" w:hint="default"/>
+      </w:rPr>
     </w:lvl>
     <w:lvl w:ilvl="5">
       <w:numFmt w:val="bullet"/>
-      <w:lvlText w:val="–"/>
+      <w:lvlText w:val=""/>
       <w:lvlJc w:val="left"/>
       <w:pPr>
-        <w:tabs>
-          <w:tab w:val="num" w:pos="3600"/>
-        </w:tabs>
-        <w:ind w:left="4080" w:hanging="480"/>
-      </w:pPr>
+        <w:ind w:left="4320" w:hanging="360"/>
+      </w:pPr>
+      <w:rPr>
+        <w:rFonts w:ascii="Wingdings" w:hAnsi="Wingdings" w:cs="Wingdings" w:hint="default"/>
+      </w:rPr>
     </w:lvl>
     <w:lvl w:ilvl="6">
       <w:numFmt w:val="bullet"/>
-      <w:lvlText w:val="•"/>
+      <w:lvlText w:val=""/>
       <w:lvlJc w:val="left"/>
       <w:pPr>
-        <w:tabs>
-          <w:tab w:val="num" w:pos="4320"/>
-        </w:tabs>
-        <w:ind w:left="4800" w:hanging="480"/>
-      </w:pPr>
+        <w:ind w:left="5040" w:hanging="360"/>
+      </w:pPr>
+      <w:rPr>
+        <w:rFonts w:ascii="Symbol" w:hAnsi="Symbol" w:cs="Symbol" w:hint="default"/>
+      </w:rPr>
     </w:lvl>
     <w:lvl w:ilvl="7">
       <w:numFmt w:val="bullet"/>
-      <w:lvlText w:val="–"/>
+      <w:lvlText w:val="o"/>
       <w:lvlJc w:val="left"/>
       <w:pPr>
-        <w:tabs>
-          <w:tab w:val="num" w:pos="5040"/>
-        </w:tabs>
-        <w:ind w:left="5520" w:hanging="480"/>
-      </w:pPr>
+        <w:ind w:left="5760" w:hanging="360"/>
+      </w:pPr>
+      <w:rPr>
+        <w:rFonts w:ascii="Courier New" w:hAnsi="Courier New" w:cs="Courier New" w:hint="default"/>
+      </w:rPr>
     </w:lvl>
     <w:lvl w:ilvl="8">
       <w:numFmt w:val="bullet"/>
-      <w:lvlText w:val="•"/>
+      <w:lvlText w:val=""/>
       <w:lvlJc w:val="left"/>
       <w:pPr>
-        <w:tabs>
-          <w:tab w:val="num" w:pos="5760"/>
-        </w:tabs>
-        <w:ind w:left="6240" w:hanging="480"/>
-      </w:pPr>
+        <w:ind w:left="6480" w:hanging="360"/>
+      </w:pPr>
+      <w:rPr>
+        <w:rFonts w:ascii="Wingdings" w:hAnsi="Wingdings" w:cs="Wingdings" w:hint="default"/>
+      </w:rPr>
     </w:lvl>
   </w:abstractNum>
   <w:num w:numId="1000">
@@ -2649,10 +2664,10 @@
   <w:docDefaults>
     <w:rPrDefault>
       <w:rPr>
-        <w:rFonts w:asciiTheme="minorHAnsi" w:eastAsiaTheme="minorHAnsi" w:hAnsiTheme="minorHAnsi" w:cstheme="minorBidi"/>
+        <w:rFonts w:asciiTheme="minorHAnsi" w:eastAsiaTheme="minorEastAsia" w:hAnsiTheme="minorHAnsi" w:cstheme="minorBidi"/>
         <w:sz w:val="24"/>
         <w:szCs w:val="24"/>
-        <w:lang w:val="en-US" w:eastAsia="en-US" w:bidi="ar-SA"/>
+        <w:lang w:val="en-US" w:eastAsia="zh-CN" w:bidi="ar-SA"/>
       </w:rPr>
     </w:rPrDefault>
     <w:pPrDefault>
@@ -2670,10 +2685,10 @@
     <w:name w:val="Body Text"/>
     <w:basedOn w:val="Normal"/>
     <w:link w:val="BodyTextChar"/>
+    <w:qFormat/>
     <w:pPr>
       <w:spacing w:before="180" w:after="180"/>
     </w:pPr>
-    <w:qFormat/>
   </w:style>
   <w:style w:type="paragraph" w:customStyle="1" w:styleId="FirstParagraph">
     <w:name w:val="First Paragraph"/>
@@ -2693,57 +2708,111 @@
     <w:name w:val="Title"/>
     <w:basedOn w:val="Normal"/>
     <w:next w:val="BodyText"/>
+    <w:link w:val="TitleChar"/>
+    <w:uiPriority w:val="10"/>
     <w:qFormat/>
+    <w:rsid w:val="00A10FD9"/>
     <w:pPr>
-      <w:keepNext/>
-      <w:keepLines/>
-      <w:spacing w:before="480" w:after="240"/>
+      <w:spacing w:after="80" w:line="240" w:lineRule="auto"/>
+      <w:contextualSpacing/>
       <w:jc w:val="center"/>
     </w:pPr>
     <w:rPr>
       <w:rFonts w:asciiTheme="majorHAnsi" w:eastAsiaTheme="majorEastAsia" w:hAnsiTheme="majorHAnsi" w:cstheme="majorBidi"/>
-      <w:b/>
-      <w:bCs/>
-      <w:color w:val="345A8A" w:themeColor="accent1" w:themeShade="B5"/>
-      <w:sz w:val="36"/>
-      <w:szCs w:val="36"/>
+      <w:sz w:val="56"/>
+      <w:szCs w:val="56"/>
+    </w:rPr>
+  </w:style>
+  <w:style w:type="character" w:customStyle="1" w:styleId="TitleChar">
+    <w:name w:val="Title Char"/>
+    <w:basedOn w:val="DefaultParagraphFont"/>
+    <w:link w:val="Title"/>
+    <w:uiPriority w:val="10"/>
+    <w:rsid w:val="00A10FD9"/>
+    <w:rPr>
+      <w:rFonts w:asciiTheme="majorHAnsi" w:eastAsiaTheme="majorEastAsia" w:hAnsiTheme="majorHAnsi" w:cstheme="majorBidi"/>
+      <w:sz w:val="56"/>
+      <w:szCs w:val="56"/>
     </w:rPr>
   </w:style>
   <w:style w:type="paragraph" w:styleId="Subtitle">
     <w:name w:val="Subtitle"/>
+    <w:basedOn w:val="Title"/>
+    <w:next w:val="BodyText"/>
+    <w:link w:val="SubtitleChar"/>
+    <w:uiPriority w:val="11"/>
+    <w:qFormat/>
+    <w:rsid w:val="00A10FD9"/>
+    <w:pPr>
+      <w:numPr>
+        <w:ilvl w:val="1"/>
+      </w:numPr>
+    </w:pPr>
+    <w:rPr>
+      <w:rFonts w:eastAsiaTheme="majorEastAsia" w:cstheme="majorBidi"/>
+      <w:spacing w:val="15"/>
+      <w:sz w:val="28"/>
+      <w:szCs w:val="28"/>
+    </w:rPr>
+  </w:style>
+  <w:style w:type="character" w:customStyle="1" w:styleId="SubtitleChar">
+    <w:name w:val="Subtitle Char"/>
+    <w:basedOn w:val="DefaultParagraphFont"/>
+    <w:link w:val="Subtitle"/>
+    <w:uiPriority w:val="11"/>
+    <w:rsid w:val="00A10FD9"/>
+    <w:rPr>
+      <w:rFonts w:eastAsiaTheme="majorEastAsia" w:cstheme="majorBidi"/>
+      <w:color w:val="595959" w:themeColor="text1" w:themeTint="A6"/>
+      <w:spacing w:val="15"/>
+      <w:sz w:val="28"/>
+      <w:szCs w:val="28"/>
+    </w:rPr>
+  </w:style>
+  <w:style w:type="paragraph" w:customStyle="1" w:styleId="Author">
+    <w:name w:val="Author"/>
     <w:basedOn w:val="Title"/>
     <w:next w:val="BodyText"/>
     <w:qFormat/>
     <w:pPr>
       <w:keepNext/>
       <w:keepLines/>
-      <w:spacing w:before="240" w:after="240"/>
-      <w:jc w:val="center"/>
     </w:pPr>
     <w:rPr>
-      <w:sz w:val="30"/>
-      <w:szCs w:val="30"/>
-    </w:rPr>
-  </w:style>
-  <w:style w:type="paragraph" w:customStyle="1" w:styleId="Author">
-    <w:name w:val="Author"/>
+      <w:sz w:val="24"/>
+      <w:szCs w:val="24"/>
+    </w:rPr>
+  </w:style>
+  <w:style w:type="paragraph" w:styleId="Date">
+    <w:name w:val="Date"/>
+    <w:basedOn w:val="Title"/>
     <w:next w:val="BodyText"/>
     <w:qFormat/>
     <w:pPr>
       <w:keepNext/>
       <w:keepLines/>
-      <w:jc w:val="center"/>
     </w:pPr>
-  </w:style>
-  <w:style w:type="paragraph" w:styleId="Date">
-    <w:name w:val="Date"/>
-    <w:next w:val="BodyText"/>
+    <w:rPr>
+      <w:sz w:val="24"/>
+      <w:szCs w:val="24"/>
+    </w:rPr>
+  </w:style>
+  <w:style w:type="paragraph" w:customStyle="1" w:styleId="AbstractTitle">
+    <w:name w:val="Abstract Title"/>
+    <w:basedOn w:val="Normal"/>
+    <w:next w:val="Abstract"/>
     <w:qFormat/>
     <w:pPr>
       <w:keepNext/>
       <w:keepLines/>
+      <w:spacing w:before="300" w:after="0"/>
       <w:jc w:val="center"/>
     </w:pPr>
+    <w:rPr>
+      <w:b/>
+      <w:sz w:val="20"/>
+      <w:szCs w:val="20"/>
+    </w:rPr>
   </w:style>
   <w:style w:type="paragraph" w:customStyle="1" w:styleId="Abstract">
     <w:name w:val="Abstract"/>
@@ -2753,7 +2822,7 @@
     <w:pPr>
       <w:keepNext/>
       <w:keepLines/>
-      <w:spacing w:before="300" w:after="300"/>
+      <w:spacing w:before="100" w:after="300"/>
     </w:pPr>
     <w:rPr>
       <w:sz w:val="20"/>
@@ -2769,191 +2838,321 @@
     <w:rPr/>
   </w:style>
   <w:style w:type="paragraph" w:styleId="Heading1">
-    <w:name w:val="Heading 1"/>
+    <w:name w:val="heading 1"/>
     <w:basedOn w:val="Normal"/>
     <w:next w:val="BodyText"/>
+    <w:link w:val="Heading1Char"/>
     <w:uiPriority w:val="9"/>
     <w:qFormat/>
+    <w:rsid w:val="00A10FD9"/>
     <w:pPr>
       <w:keepNext/>
       <w:keepLines/>
-      <w:spacing w:before="480" w:after="0"/>
+      <w:spacing w:before="360" w:after="80"/>
       <w:outlineLvl w:val="0"/>
     </w:pPr>
     <w:rPr>
       <w:rFonts w:asciiTheme="majorHAnsi" w:eastAsiaTheme="majorEastAsia" w:hAnsiTheme="majorHAnsi" w:cstheme="majorBidi"/>
-      <w:b/>
-      <w:bCs/>
-      <w:color w:val="4F81BD" w:themeColor="accent1"/>
-      <w:sz w:val="32"/>
-      <w:szCs w:val="32"/>
+      <w:color w:val="0F4761" w:themeColor="accent1" w:themeShade="BF"/>
+      <w:sz w:val="40"/>
+      <w:szCs w:val="40"/>
     </w:rPr>
   </w:style>
   <w:style w:type="paragraph" w:styleId="Heading2">
-    <w:name w:val="Heading 2"/>
+    <w:name w:val="heading 2"/>
     <w:basedOn w:val="Normal"/>
     <w:next w:val="BodyText"/>
+    <w:link w:val="Heading2Char"/>
     <w:uiPriority w:val="9"/>
+    <w:semiHidden/>
     <w:unhideWhenUsed/>
     <w:qFormat/>
+    <w:rsid w:val="00A10FD9"/>
     <w:pPr>
       <w:keepNext/>
       <w:keepLines/>
-      <w:spacing w:before="200" w:after="0"/>
+      <w:spacing w:before="160" w:after="80"/>
       <w:outlineLvl w:val="1"/>
     </w:pPr>
     <w:rPr>
       <w:rFonts w:asciiTheme="majorHAnsi" w:eastAsiaTheme="majorEastAsia" w:hAnsiTheme="majorHAnsi" w:cstheme="majorBidi"/>
-      <w:b/>
-      <w:bCs/>
-      <w:color w:val="4F81BD" w:themeColor="accent1"/>
-      <w:sz w:val="28"/>
-      <w:szCs w:val="28"/>
+      <w:color w:val="0F4761" w:themeColor="accent1" w:themeShade="BF"/>
+      <w:sz w:val="32"/>
+      <w:szCs w:val="32"/>
     </w:rPr>
   </w:style>
   <w:style w:type="paragraph" w:styleId="Heading3">
-    <w:name w:val="Heading 3"/>
+    <w:name w:val="heading 3"/>
     <w:basedOn w:val="Normal"/>
     <w:next w:val="BodyText"/>
+    <w:link w:val="Heading3Char"/>
     <w:uiPriority w:val="9"/>
+    <w:semiHidden/>
     <w:unhideWhenUsed/>
     <w:qFormat/>
+    <w:rsid w:val="00A10FD9"/>
     <w:pPr>
       <w:keepNext/>
       <w:keepLines/>
-      <w:spacing w:before="200" w:after="0"/>
+      <w:spacing w:before="160" w:after="80"/>
       <w:outlineLvl w:val="2"/>
     </w:pPr>
     <w:rPr>
-      <w:rFonts w:asciiTheme="majorHAnsi" w:eastAsiaTheme="majorEastAsia" w:hAnsiTheme="majorHAnsi" w:cstheme="majorBidi"/>
-      <w:b/>
-      <w:bCs/>
-      <w:color w:val="4F81BD" w:themeColor="accent1"/>
-      <w:sz w:val="24"/>
-      <w:szCs w:val="24"/>
+      <w:rFonts w:eastAsiaTheme="majorEastAsia" w:cstheme="majorBidi"/>
+      <w:color w:val="0F4761" w:themeColor="accent1" w:themeShade="BF"/>
+      <w:sz w:val="28"/>
+      <w:szCs w:val="28"/>
     </w:rPr>
   </w:style>
   <w:style w:type="paragraph" w:styleId="Heading4">
-    <w:name w:val="Heading 4"/>
+    <w:name w:val="heading 4"/>
     <w:basedOn w:val="Normal"/>
     <w:next w:val="BodyText"/>
+    <w:link w:val="Heading4Char"/>
     <w:uiPriority w:val="9"/>
+    <w:semiHidden/>
     <w:unhideWhenUsed/>
     <w:qFormat/>
+    <w:rsid w:val="00A10FD9"/>
     <w:pPr>
       <w:keepNext/>
       <w:keepLines/>
-      <w:spacing w:before="200" w:after="0"/>
+      <w:spacing w:before="80" w:after="40"/>
       <w:outlineLvl w:val="3"/>
     </w:pPr>
     <w:rPr>
-      <w:rFonts w:asciiTheme="majorHAnsi" w:eastAsiaTheme="majorEastAsia" w:hAnsiTheme="majorHAnsi" w:cstheme="majorBidi"/>
+      <w:rFonts w:eastAsiaTheme="majorEastAsia" w:cstheme="majorBidi"/>
       <w:i/>
-      <w:bCs/>
-      <w:color w:val="4F81BD" w:themeColor="accent1"/>
-      <w:sz w:val="24"/>
-      <w:szCs w:val="24"/>
+      <w:iCs/>
+      <w:color w:val="0F4761" w:themeColor="accent1" w:themeShade="BF"/>
     </w:rPr>
   </w:style>
   <w:style w:type="paragraph" w:styleId="Heading5">
-    <w:name w:val="Heading 5"/>
+    <w:name w:val="heading 5"/>
     <w:basedOn w:val="Normal"/>
     <w:next w:val="BodyText"/>
+    <w:link w:val="Heading5Char"/>
     <w:uiPriority w:val="9"/>
+    <w:semiHidden/>
     <w:unhideWhenUsed/>
     <w:qFormat/>
+    <w:rsid w:val="00A10FD9"/>
     <w:pPr>
       <w:keepNext/>
       <w:keepLines/>
-      <w:spacing w:before="200" w:after="0"/>
+      <w:spacing w:before="80" w:after="40"/>
       <w:outlineLvl w:val="4"/>
     </w:pPr>
     <w:rPr>
-      <w:rFonts w:asciiTheme="majorHAnsi" w:eastAsiaTheme="majorEastAsia" w:hAnsiTheme="majorHAnsi" w:cstheme="majorBidi"/>
-      <w:iCs/>
-      <w:color w:val="4F81BD" w:themeColor="accent1"/>
-      <w:sz w:val="24"/>
-      <w:szCs w:val="24"/>
+      <w:rFonts w:eastAsiaTheme="majorEastAsia" w:cstheme="majorBidi"/>
+      <w:color w:val="0F4761" w:themeColor="accent1" w:themeShade="BF"/>
     </w:rPr>
   </w:style>
   <w:style w:type="paragraph" w:styleId="Heading6">
-    <w:name w:val="Heading 6"/>
+    <w:name w:val="heading 6"/>
     <w:basedOn w:val="Normal"/>
     <w:next w:val="BodyText"/>
+    <w:link w:val="Heading6Char"/>
     <w:uiPriority w:val="9"/>
+    <w:semiHidden/>
     <w:unhideWhenUsed/>
     <w:qFormat/>
+    <w:rsid w:val="00A10FD9"/>
     <w:pPr>
       <w:keepNext/>
       <w:keepLines/>
-      <w:spacing w:before="200" w:after="0"/>
+      <w:spacing w:before="40" w:after="0"/>
       <w:outlineLvl w:val="5"/>
     </w:pPr>
     <w:rPr>
-      <w:rFonts w:asciiTheme="majorHAnsi" w:eastAsiaTheme="majorEastAsia" w:hAnsiTheme="majorHAnsi" w:cstheme="majorBidi"/>
-      <w:color w:val="4F81BD" w:themeColor="accent1"/>
-      <w:sz w:val="24"/>
-      <w:szCs w:val="24"/>
+      <w:rFonts w:eastAsiaTheme="majorEastAsia" w:cstheme="majorBidi"/>
+      <w:i/>
+      <w:iCs/>
+      <w:color w:val="595959" w:themeColor="text1" w:themeTint="A6"/>
     </w:rPr>
   </w:style>
   <w:style w:type="paragraph" w:styleId="Heading7">
-    <w:name w:val="Heading 7"/>
+    <w:name w:val="heading 7"/>
     <w:basedOn w:val="Normal"/>
     <w:next w:val="BodyText"/>
+    <w:link w:val="Heading7Char"/>
     <w:uiPriority w:val="9"/>
+    <w:semiHidden/>
     <w:unhideWhenUsed/>
     <w:qFormat/>
+    <w:rsid w:val="00A10FD9"/>
     <w:pPr>
       <w:keepNext/>
       <w:keepLines/>
-      <w:spacing w:before="200" w:after="0"/>
+      <w:spacing w:before="40" w:after="0"/>
       <w:outlineLvl w:val="6"/>
     </w:pPr>
     <w:rPr>
-      <w:rFonts w:asciiTheme="majorHAnsi" w:eastAsiaTheme="majorEastAsia" w:hAnsiTheme="majorHAnsi" w:cstheme="majorBidi"/>
-      <w:color w:val="4F81BD" w:themeColor="accent1"/>
-      <w:sz w:val="24"/>
-      <w:szCs w:val="24"/>
+      <w:rFonts w:eastAsiaTheme="majorEastAsia" w:cstheme="majorBidi"/>
+      <w:color w:val="595959" w:themeColor="text1" w:themeTint="A6"/>
     </w:rPr>
   </w:style>
   <w:style w:type="paragraph" w:styleId="Heading8">
-    <w:name w:val="Heading 8"/>
+    <w:name w:val="heading 8"/>
     <w:basedOn w:val="Normal"/>
     <w:next w:val="BodyText"/>
+    <w:link w:val="Heading8Char"/>
     <w:uiPriority w:val="9"/>
+    <w:semiHidden/>
     <w:unhideWhenUsed/>
     <w:qFormat/>
+    <w:rsid w:val="00A10FD9"/>
     <w:pPr>
       <w:keepNext/>
       <w:keepLines/>
-      <w:spacing w:before="200" w:after="0"/>
+      <w:spacing w:after="0"/>
       <w:outlineLvl w:val="7"/>
     </w:pPr>
     <w:rPr>
-      <w:rFonts w:asciiTheme="majorHAnsi" w:eastAsiaTheme="majorEastAsia" w:hAnsiTheme="majorHAnsi" w:cstheme="majorBidi"/>
-      <w:color w:val="4F81BD" w:themeColor="accent1"/>
-      <w:sz w:val="24"/>
-      <w:szCs w:val="24"/>
+      <w:rFonts w:eastAsiaTheme="majorEastAsia" w:cstheme="majorBidi"/>
+      <w:i/>
+      <w:iCs/>
+      <w:color w:val="272727" w:themeColor="text1" w:themeTint="D8"/>
     </w:rPr>
   </w:style>
   <w:style w:type="paragraph" w:styleId="Heading9">
-    <w:name w:val="Heading 9"/>
+    <w:name w:val="heading 9"/>
     <w:basedOn w:val="Normal"/>
     <w:next w:val="BodyText"/>
+    <w:link w:val="Heading9Char"/>
     <w:uiPriority w:val="9"/>
+    <w:semiHidden/>
     <w:unhideWhenUsed/>
     <w:qFormat/>
+    <w:rsid w:val="00A10FD9"/>
     <w:pPr>
       <w:keepNext/>
       <w:keepLines/>
-      <w:spacing w:before="200" w:after="0"/>
+      <w:spacing w:after="0"/>
       <w:outlineLvl w:val="8"/>
     </w:pPr>
     <w:rPr>
+      <w:rFonts w:eastAsiaTheme="majorEastAsia" w:cstheme="majorBidi"/>
+      <w:color w:val="272727" w:themeColor="text1" w:themeTint="D8"/>
+    </w:rPr>
+  </w:style>
+  <w:style w:type="character" w:customStyle="1" w:styleId="Heading1Char">
+    <w:name w:val="Heading 1 Char"/>
+    <w:basedOn w:val="DefaultParagraphFont"/>
+    <w:link w:val="Heading1"/>
+    <w:uiPriority w:val="9"/>
+    <w:rsid w:val="00A10FD9"/>
+    <w:rPr>
       <w:rFonts w:asciiTheme="majorHAnsi" w:eastAsiaTheme="majorEastAsia" w:hAnsiTheme="majorHAnsi" w:cstheme="majorBidi"/>
-      <w:color w:val="4F81BD" w:themeColor="accent1"/>
-      <w:sz w:val="24"/>
-      <w:szCs w:val="24"/>
+      <w:color w:val="0F4761" w:themeColor="accent1" w:themeShade="BF"/>
+      <w:sz w:val="40"/>
+      <w:szCs w:val="40"/>
+    </w:rPr>
+  </w:style>
+  <w:style w:type="character" w:customStyle="1" w:styleId="Heading2Char">
+    <w:name w:val="Heading 2 Char"/>
+    <w:basedOn w:val="DefaultParagraphFont"/>
+    <w:link w:val="Heading2"/>
+    <w:uiPriority w:val="9"/>
+    <w:semiHidden/>
+    <w:rsid w:val="00A10FD9"/>
+    <w:rPr>
+      <w:rFonts w:asciiTheme="majorHAnsi" w:eastAsiaTheme="majorEastAsia" w:hAnsiTheme="majorHAnsi" w:cstheme="majorBidi"/>
+      <w:color w:val="0F4761" w:themeColor="accent1" w:themeShade="BF"/>
+      <w:sz w:val="32"/>
+      <w:szCs w:val="32"/>
+    </w:rPr>
+  </w:style>
+  <w:style w:type="character" w:customStyle="1" w:styleId="Heading3Char">
+    <w:name w:val="Heading 3 Char"/>
+    <w:basedOn w:val="DefaultParagraphFont"/>
+    <w:link w:val="Heading3"/>
+    <w:uiPriority w:val="9"/>
+    <w:semiHidden/>
+    <w:rsid w:val="00A10FD9"/>
+    <w:rPr>
+      <w:rFonts w:eastAsiaTheme="majorEastAsia" w:cstheme="majorBidi"/>
+      <w:color w:val="0F4761" w:themeColor="accent1" w:themeShade="BF"/>
+      <w:sz w:val="28"/>
+      <w:szCs w:val="28"/>
+    </w:rPr>
+  </w:style>
+  <w:style w:type="character" w:customStyle="1" w:styleId="Heading4Char">
+    <w:name w:val="Heading 4 Char"/>
+    <w:basedOn w:val="DefaultParagraphFont"/>
+    <w:link w:val="Heading4"/>
+    <w:uiPriority w:val="9"/>
+    <w:semiHidden/>
+    <w:rsid w:val="00A10FD9"/>
+    <w:rPr>
+      <w:rFonts w:eastAsiaTheme="majorEastAsia" w:cstheme="majorBidi"/>
+      <w:i/>
+      <w:iCs/>
+      <w:color w:val="0F4761" w:themeColor="accent1" w:themeShade="BF"/>
+    </w:rPr>
+  </w:style>
+  <w:style w:type="character" w:customStyle="1" w:styleId="Heading5Char">
+    <w:name w:val="Heading 5 Char"/>
+    <w:basedOn w:val="DefaultParagraphFont"/>
+    <w:link w:val="Heading5"/>
+    <w:uiPriority w:val="9"/>
+    <w:semiHidden/>
+    <w:rsid w:val="00A10FD9"/>
+    <w:rPr>
+      <w:rFonts w:eastAsiaTheme="majorEastAsia" w:cstheme="majorBidi"/>
+      <w:color w:val="0F4761" w:themeColor="accent1" w:themeShade="BF"/>
+    </w:rPr>
+  </w:style>
+  <w:style w:type="character" w:customStyle="1" w:styleId="Heading6Char">
+    <w:name w:val="Heading 6 Char"/>
+    <w:basedOn w:val="DefaultParagraphFont"/>
+    <w:link w:val="Heading6"/>
+    <w:uiPriority w:val="9"/>
+    <w:semiHidden/>
+    <w:rsid w:val="00A10FD9"/>
+    <w:rPr>
+      <w:rFonts w:eastAsiaTheme="majorEastAsia" w:cstheme="majorBidi"/>
+      <w:i/>
+      <w:iCs/>
+      <w:color w:val="595959" w:themeColor="text1" w:themeTint="A6"/>
+    </w:rPr>
+  </w:style>
+  <w:style w:type="character" w:customStyle="1" w:styleId="Heading7Char">
+    <w:name w:val="Heading 7 Char"/>
+    <w:basedOn w:val="DefaultParagraphFont"/>
+    <w:link w:val="Heading7"/>
+    <w:uiPriority w:val="9"/>
+    <w:semiHidden/>
+    <w:rsid w:val="00A10FD9"/>
+    <w:rPr>
+      <w:rFonts w:eastAsiaTheme="majorEastAsia" w:cstheme="majorBidi"/>
+      <w:color w:val="595959" w:themeColor="text1" w:themeTint="A6"/>
+    </w:rPr>
+  </w:style>
+  <w:style w:type="character" w:customStyle="1" w:styleId="Heading8Char">
+    <w:name w:val="Heading 8 Char"/>
+    <w:basedOn w:val="DefaultParagraphFont"/>
+    <w:link w:val="Heading8"/>
+    <w:uiPriority w:val="9"/>
+    <w:semiHidden/>
+    <w:rsid w:val="00A10FD9"/>
+    <w:rPr>
+      <w:rFonts w:eastAsiaTheme="majorEastAsia" w:cstheme="majorBidi"/>
+      <w:i/>
+      <w:iCs/>
+      <w:color w:val="272727" w:themeColor="text1" w:themeTint="D8"/>
+    </w:rPr>
+  </w:style>
+  <w:style w:type="character" w:customStyle="1" w:styleId="Heading9Char">
+    <w:name w:val="Heading 9 Char"/>
+    <w:basedOn w:val="DefaultParagraphFont"/>
+    <w:link w:val="Heading9"/>
+    <w:uiPriority w:val="9"/>
+    <w:semiHidden/>
+    <w:rsid w:val="00A10FD9"/>
+    <w:rPr>
+      <w:rFonts w:eastAsiaTheme="majorEastAsia" w:cstheme="majorBidi"/>
+      <w:color w:val="272727" w:themeColor="text1" w:themeTint="D8"/>
     </w:rPr>
   </w:style>
   <w:style w:type="paragraph" w:styleId="BlockText">
@@ -2976,6 +3175,18 @@
     <w:unhideWhenUsed/>
     <w:qFormat/>
   </w:style>
+  <w:style w:type="paragraph" w:styleId="FootnoteBlockText">
+    <w:name w:val="Footnote Block Text"/>
+    <w:basedOn w:val="FootnoteText"/>
+    <w:next w:val="FootnoteText"/>
+    <w:uiPriority w:val="9"/>
+    <w:unhideWhenUsed/>
+    <w:qFormat/>
+    <w:pPr>
+      <w:spacing w:before="100" w:after="100"/>
+      <w:ind w:firstLine="0" w:left="480" w:right="480"/>
+    </w:pPr>
+  </w:style>
   <w:style w:type="character" w:default="1" w:styleId="DefaultParagraphFont">
     <w:name w:val="Default Paragraph Font"/>
     <w:semiHidden/>
@@ -2984,8 +3195,6 @@
   <w:style w:type="table" w:default="1" w:styleId="Table">
     <w:name w:val="Table"/>
     <w:basedOn w:val="TableNormal"/>
-    <w:semiHidden/>
-    <w:unhideWhenUsed/>
     <w:qFormat/>
     <w:tblPr>
       <w:tblInd w:w="0" w:type="dxa"/>
@@ -2996,6 +3205,14 @@
         <w:right w:w="108" w:type="dxa"/>
       </w:tblCellMar>
     </w:tblPr>
+    <w:tblStylePr w:type="firstRow">
+      <w:tcPr>
+        <w:tcBorders>
+          <w:bottom w:val="single"/>
+        </w:tcBorders>
+        <w:vAlign w:val="bottom"/>
+      </w:tcPr>
+    </w:tblStylePr>
   </w:style>
   <w:style w:type="paragraph" w:customStyle="1" w:styleId="DefinitionTerm">
     <w:name w:val="Definition Term"/>
@@ -3059,6 +3276,10 @@
       <w:rFonts w:ascii="Consolas" w:hAnsi="Consolas"/>
       <w:sz w:val="22"/>
     </w:rPr>
+  </w:style>
+  <w:style w:type="character" w:customStyle="1" w:styleId="SectionNumber">
+    <w:name w:val="Section Number"/>
+    <w:basedOn w:val="BodyTextChar"/>
   </w:style>
   <w:style w:type="character" w:styleId="FootnoteReference">
     <w:name w:val="Footnote Reference"/>
@@ -3104,8 +3325,8 @@
     <w:name w:val="KeywordTok"/>
     <w:basedOn w:val="VerbatimChar"/>
     <w:rPr>
+      <w:b/>
       <w:color w:val="007020"/>
-      <w:b/>
     </w:rPr>
   </w:style>
   <w:style w:type="character" w:customStyle="1" w:styleId="DataTypeTok">
@@ -3181,40 +3402,43 @@
   <w:style w:type="character" w:customStyle="1" w:styleId="ImportTok">
     <w:name w:val="ImportTok"/>
     <w:basedOn w:val="VerbatimChar"/>
-    <w:rPr/>
+    <w:rPr>
+      <w:b/>
+      <w:color w:val="008000"/>
+    </w:rPr>
   </w:style>
   <w:style w:type="character" w:customStyle="1" w:styleId="CommentTok">
     <w:name w:val="CommentTok"/>
     <w:basedOn w:val="VerbatimChar"/>
     <w:rPr>
+      <w:i/>
       <w:color w:val="60a0b0"/>
-      <w:i/>
     </w:rPr>
   </w:style>
   <w:style w:type="character" w:customStyle="1" w:styleId="DocumentationTok">
     <w:name w:val="DocumentationTok"/>
     <w:basedOn w:val="VerbatimChar"/>
     <w:rPr>
+      <w:i/>
       <w:color w:val="ba2121"/>
-      <w:i/>
     </w:rPr>
   </w:style>
   <w:style w:type="character" w:customStyle="1" w:styleId="AnnotationTok">
     <w:name w:val="AnnotationTok"/>
     <w:basedOn w:val="VerbatimChar"/>
     <w:rPr>
-      <w:color w:val="60a0b0"/>
       <w:b/>
       <w:i/>
+      <w:color w:val="60a0b0"/>
     </w:rPr>
   </w:style>
   <w:style w:type="character" w:customStyle="1" w:styleId="CommentVarTok">
     <w:name w:val="CommentVarTok"/>
     <w:basedOn w:val="VerbatimChar"/>
     <w:rPr>
-      <w:color w:val="60a0b0"/>
       <w:b/>
       <w:i/>
+      <w:color w:val="60a0b0"/>
     </w:rPr>
   </w:style>
   <w:style w:type="character" w:customStyle="1" w:styleId="OtherTok">
@@ -3242,8 +3466,8 @@
     <w:name w:val="ControlFlowTok"/>
     <w:basedOn w:val="VerbatimChar"/>
     <w:rPr>
+      <w:b/>
       <w:color w:val="007020"/>
-      <w:b/>
     </w:rPr>
   </w:style>
   <w:style w:type="character" w:customStyle="1" w:styleId="OperatorTok">
@@ -3256,7 +3480,9 @@
   <w:style w:type="character" w:customStyle="1" w:styleId="BuiltInTok">
     <w:name w:val="BuiltInTok"/>
     <w:basedOn w:val="VerbatimChar"/>
-    <w:rPr/>
+    <w:rPr>
+      <w:color w:val="008000"/>
+    </w:rPr>
   </w:style>
   <w:style w:type="character" w:customStyle="1" w:styleId="ExtensionTok">
     <w:name w:val="ExtensionTok"/>
@@ -3286,34 +3512,34 @@
     <w:name w:val="InformationTok"/>
     <w:basedOn w:val="VerbatimChar"/>
     <w:rPr>
-      <w:color w:val="60a0b0"/>
       <w:b/>
       <w:i/>
+      <w:color w:val="60a0b0"/>
     </w:rPr>
   </w:style>
   <w:style w:type="character" w:customStyle="1" w:styleId="WarningTok">
     <w:name w:val="WarningTok"/>
     <w:basedOn w:val="VerbatimChar"/>
     <w:rPr>
-      <w:color w:val="60a0b0"/>
       <w:b/>
       <w:i/>
+      <w:color w:val="60a0b0"/>
     </w:rPr>
   </w:style>
   <w:style w:type="character" w:customStyle="1" w:styleId="AlertTok">
     <w:name w:val="AlertTok"/>
     <w:basedOn w:val="VerbatimChar"/>
     <w:rPr>
+      <w:b/>
       <w:color w:val="ff0000"/>
-      <w:b/>
     </w:rPr>
   </w:style>
   <w:style w:type="character" w:customStyle="1" w:styleId="ErrorTok">
     <w:name w:val="ErrorTok"/>
     <w:basedOn w:val="VerbatimChar"/>
     <w:rPr>
+      <w:b/>
       <w:color w:val="ff0000"/>
-      <w:b/>
     </w:rPr>
   </w:style>
   <w:style w:type="character" w:customStyle="1" w:styleId="NormalTok">
@@ -3335,44 +3561,44 @@
         <a:sysClr val="window" lastClr="FFFFFF"/>
       </a:lt1>
       <a:dk2>
-        <a:srgbClr val="1F497D"/>
+        <a:srgbClr val="0E2841"/>
       </a:dk2>
       <a:lt2>
-        <a:srgbClr val="EEECE1"/>
+        <a:srgbClr val="E8E8E8"/>
       </a:lt2>
       <a:accent1>
-        <a:srgbClr val="4F81BD"/>
+        <a:srgbClr val="156082"/>
       </a:accent1>
       <a:accent2>
-        <a:srgbClr val="C0504D"/>
+        <a:srgbClr val="E97132"/>
       </a:accent2>
       <a:accent3>
-        <a:srgbClr val="9BBB59"/>
+        <a:srgbClr val="196B24"/>
       </a:accent3>
       <a:accent4>
-        <a:srgbClr val="8064A2"/>
+        <a:srgbClr val="0F9ED5"/>
       </a:accent4>
       <a:accent5>
-        <a:srgbClr val="4BACC6"/>
+        <a:srgbClr val="A02B93"/>
       </a:accent5>
       <a:accent6>
-        <a:srgbClr val="F79646"/>
+        <a:srgbClr val="4EA72E"/>
       </a:accent6>
       <a:hlink>
-        <a:srgbClr val="0000FF"/>
+        <a:srgbClr val="467886"/>
       </a:hlink>
       <a:folHlink>
-        <a:srgbClr val="800080"/>
+        <a:srgbClr val="96607D"/>
       </a:folHlink>
     </a:clrScheme>
     <a:fontScheme name="Office">
       <a:majorFont>
-        <a:latin typeface="Calibri"/>
+        <a:latin typeface="Aptos Display" panose="02110004020202020204"/>
         <a:ea typeface=""/>
         <a:cs typeface=""/>
-        <a:font script="Jpan" typeface="ＭＳ ゴシック"/>
+        <a:font script="Jpan" typeface="游ゴシック Light"/>
         <a:font script="Hang" typeface="맑은 고딕"/>
-        <a:font script="Hans" typeface="宋体"/>
+        <a:font script="Hans" typeface="等线 Light"/>
         <a:font script="Hant" typeface="新細明體"/>
         <a:font script="Arab" typeface="Times New Roman"/>
         <a:font script="Hebr" typeface="Times New Roman"/>
@@ -3399,14 +3625,32 @@
         <a:font script="Mong" typeface="Mongolian Baiti"/>
         <a:font script="Viet" typeface="Times New Roman"/>
         <a:font script="Uigh" typeface="Microsoft Uighur"/>
+        <a:font script="Geor" typeface="Sylfaen"/>
+        <a:font script="Armn" typeface="Arial"/>
+        <a:font script="Bugi" typeface="Leelawadee UI"/>
+        <a:font script="Bopo" typeface="Microsoft JhengHei"/>
+        <a:font script="Java" typeface="Javanese Text"/>
+        <a:font script="Lisu" typeface="Segoe UI"/>
+        <a:font script="Mymr" typeface="Myanmar Text"/>
+        <a:font script="Nkoo" typeface="Ebrima"/>
+        <a:font script="Olck" typeface="Nirmala UI"/>
+        <a:font script="Osma" typeface="Ebrima"/>
+        <a:font script="Phag" typeface="Phagspa"/>
+        <a:font script="Syrn" typeface="Estrangelo Edessa"/>
+        <a:font script="Syrj" typeface="Estrangelo Edessa"/>
+        <a:font script="Syre" typeface="Estrangelo Edessa"/>
+        <a:font script="Sora" typeface="Nirmala UI"/>
+        <a:font script="Tale" typeface="Microsoft Tai Le"/>
+        <a:font script="Talu" typeface="Microsoft New Tai Lue"/>
+        <a:font script="Tfng" typeface="Ebrima"/>
       </a:majorFont>
       <a:minorFont>
-        <a:latin typeface="Cambria"/>
+        <a:latin typeface="Aptos" panose="02110004020202020204"/>
         <a:ea typeface=""/>
         <a:cs typeface=""/>
-        <a:font script="Jpan" typeface="ＭＳ 明朝"/>
+        <a:font script="Jpan" typeface="游明朝"/>
         <a:font script="Hang" typeface="맑은 고딕"/>
-        <a:font script="Hans" typeface="宋体"/>
+        <a:font script="Hans" typeface="等线"/>
         <a:font script="Hant" typeface="新細明體"/>
         <a:font script="Arab" typeface="Arial"/>
         <a:font script="Hebr" typeface="Arial"/>
@@ -3433,6 +3677,24 @@
         <a:font script="Mong" typeface="Mongolian Baiti"/>
         <a:font script="Viet" typeface="Arial"/>
         <a:font script="Uigh" typeface="Microsoft Uighur"/>
+        <a:font script="Geor" typeface="Sylfaen"/>
+        <a:font script="Armn" typeface="Arial"/>
+        <a:font script="Bugi" typeface="Leelawadee UI"/>
+        <a:font script="Bopo" typeface="Microsoft JhengHei"/>
+        <a:font script="Java" typeface="Javanese Text"/>
+        <a:font script="Lisu" typeface="Segoe UI"/>
+        <a:font script="Mymr" typeface="Myanmar Text"/>
+        <a:font script="Nkoo" typeface="Ebrima"/>
+        <a:font script="Olck" typeface="Nirmala UI"/>
+        <a:font script="Osma" typeface="Ebrima"/>
+        <a:font script="Phag" typeface="Phagspa"/>
+        <a:font script="Syrn" typeface="Estrangelo Edessa"/>
+        <a:font script="Syrj" typeface="Estrangelo Edessa"/>
+        <a:font script="Syre" typeface="Estrangelo Edessa"/>
+        <a:font script="Sora" typeface="Nirmala UI"/>
+        <a:font script="Tale" typeface="Microsoft Tai Le"/>
+        <a:font script="Talu" typeface="Microsoft New Tai Lue"/>
+        <a:font script="Tfng" typeface="Ebrima"/>
       </a:minorFont>
     </a:fontScheme>
     <a:fmtScheme name="Office">
@@ -3444,200 +3706,141 @@
           <a:gsLst>
             <a:gs pos="0">
               <a:schemeClr val="phClr">
-                <a:tint val="50000"/>
-                <a:satMod val="300000"/>
+                <a:lumMod val="110000"/>
+                <a:satMod val="105000"/>
+                <a:tint val="67000"/>
               </a:schemeClr>
             </a:gs>
-            <a:gs pos="35000">
+            <a:gs pos="50000">
               <a:schemeClr val="phClr">
-                <a:tint val="37000"/>
-                <a:satMod val="300000"/>
+                <a:lumMod val="105000"/>
+                <a:satMod val="103000"/>
+                <a:tint val="73000"/>
               </a:schemeClr>
             </a:gs>
             <a:gs pos="100000">
               <a:schemeClr val="phClr">
-                <a:tint val="15000"/>
-                <a:satMod val="350000"/>
+                <a:lumMod val="105000"/>
+                <a:satMod val="109000"/>
+                <a:tint val="81000"/>
               </a:schemeClr>
             </a:gs>
           </a:gsLst>
-          <a:lin ang="16200000" scaled="1"/>
+          <a:lin ang="5400000" scaled="0"/>
         </a:gradFill>
         <a:gradFill rotWithShape="1">
           <a:gsLst>
             <a:gs pos="0">
               <a:schemeClr val="phClr">
-                <a:tint val="100000"/>
+                <a:satMod val="103000"/>
+                <a:lumMod val="102000"/>
+                <a:tint val="94000"/>
+              </a:schemeClr>
+            </a:gs>
+            <a:gs pos="50000">
+              <a:schemeClr val="phClr">
+                <a:satMod val="110000"/>
+                <a:lumMod val="100000"/>
                 <a:shade val="100000"/>
-                <a:satMod val="130000"/>
               </a:schemeClr>
             </a:gs>
             <a:gs pos="100000">
               <a:schemeClr val="phClr">
-                <a:tint val="50000"/>
-                <a:shade val="100000"/>
-                <a:satMod val="350000"/>
+                <a:lumMod val="99000"/>
+                <a:satMod val="120000"/>
+                <a:shade val="78000"/>
               </a:schemeClr>
             </a:gs>
           </a:gsLst>
-          <a:lin ang="16200000" scaled="0"/>
+          <a:lin ang="5400000" scaled="0"/>
         </a:gradFill>
       </a:fillStyleLst>
       <a:lnStyleLst>
-        <a:ln w="9525" cap="flat" cmpd="sng" algn="ctr">
-          <a:solidFill>
-            <a:schemeClr val="phClr">
-              <a:shade val="95000"/>
-              <a:satMod val="105000"/>
-            </a:schemeClr>
-          </a:solidFill>
-          <a:prstDash val="solid"/>
-        </a:ln>
-        <a:ln w="25400" cap="flat" cmpd="sng" algn="ctr">
+        <a:ln w="6350" cap="flat" cmpd="sng" algn="ctr">
           <a:solidFill>
             <a:schemeClr val="phClr"/>
           </a:solidFill>
           <a:prstDash val="solid"/>
+          <a:miter lim="800000"/>
         </a:ln>
-        <a:ln w="38100" cap="flat" cmpd="sng" algn="ctr">
+        <a:ln w="12700" cap="flat" cmpd="sng" algn="ctr">
           <a:solidFill>
             <a:schemeClr val="phClr"/>
           </a:solidFill>
           <a:prstDash val="solid"/>
+          <a:miter lim="800000"/>
+        </a:ln>
+        <a:ln w="19050" cap="flat" cmpd="sng" algn="ctr">
+          <a:solidFill>
+            <a:schemeClr val="phClr"/>
+          </a:solidFill>
+          <a:prstDash val="solid"/>
+          <a:miter lim="800000"/>
         </a:ln>
       </a:lnStyleLst>
       <a:effectStyleLst>
         <a:effectStyle>
+          <a:effectLst/>
+        </a:effectStyle>
+        <a:effectStyle>
+          <a:effectLst/>
+        </a:effectStyle>
+        <a:effectStyle>
           <a:effectLst>
-            <a:outerShdw blurRad="40000" dist="20000" dir="5400000" rotWithShape="0">
+            <a:outerShdw blurRad="57150" dist="19050" dir="5400000" algn="ctr" rotWithShape="0">
               <a:srgbClr val="000000">
-                <a:alpha val="38000"/>
+                <a:alpha val="63000"/>
               </a:srgbClr>
             </a:outerShdw>
           </a:effectLst>
-        </a:effectStyle>
-        <a:effectStyle>
-          <a:effectLst>
-            <a:outerShdw blurRad="40000" dist="23000" dir="5400000" rotWithShape="0">
-              <a:srgbClr val="000000">
-                <a:alpha val="35000"/>
-              </a:srgbClr>
-            </a:outerShdw>
-          </a:effectLst>
-        </a:effectStyle>
-        <a:effectStyle>
-          <a:effectLst>
-            <a:outerShdw blurRad="40000" dist="23000" dir="5400000" rotWithShape="0">
-              <a:srgbClr val="000000">
-                <a:alpha val="35000"/>
-              </a:srgbClr>
-            </a:outerShdw>
-          </a:effectLst>
-          <a:scene3d>
-            <a:camera prst="orthographicFront">
-              <a:rot lat="0" lon="0" rev="0"/>
-            </a:camera>
-            <a:lightRig rig="threePt" dir="t">
-              <a:rot lat="0" lon="0" rev="1200000"/>
-            </a:lightRig>
-          </a:scene3d>
-          <a:sp3d>
-            <a:bevelT w="63500" h="25400"/>
-          </a:sp3d>
         </a:effectStyle>
       </a:effectStyleLst>
       <a:bgFillStyleLst>
         <a:solidFill>
           <a:schemeClr val="phClr"/>
         </a:solidFill>
+        <a:solidFill>
+          <a:schemeClr val="phClr">
+            <a:tint val="95000"/>
+            <a:satMod val="170000"/>
+          </a:schemeClr>
+        </a:solidFill>
         <a:gradFill rotWithShape="1">
           <a:gsLst>
             <a:gs pos="0">
               <a:schemeClr val="phClr">
-                <a:tint val="40000"/>
-                <a:satMod val="350000"/>
+                <a:tint val="93000"/>
+                <a:satMod val="150000"/>
+                <a:shade val="98000"/>
+                <a:lumMod val="102000"/>
               </a:schemeClr>
             </a:gs>
-            <a:gs pos="40000">
+            <a:gs pos="50000">
               <a:schemeClr val="phClr">
-                <a:tint val="45000"/>
-                <a:shade val="99000"/>
-                <a:satMod val="350000"/>
+                <a:tint val="98000"/>
+                <a:satMod val="130000"/>
+                <a:shade val="90000"/>
+                <a:lumMod val="103000"/>
               </a:schemeClr>
             </a:gs>
             <a:gs pos="100000">
               <a:schemeClr val="phClr">
-                <a:shade val="20000"/>
-                <a:satMod val="255000"/>
+                <a:shade val="63000"/>
+                <a:satMod val="120000"/>
               </a:schemeClr>
             </a:gs>
           </a:gsLst>
-          <a:path path="circle">
-            <a:fillToRect l="50000" t="-80000" r="50000" b="180000"/>
-          </a:path>
-        </a:gradFill>
-        <a:gradFill rotWithShape="1">
-          <a:gsLst>
-            <a:gs pos="0">
-              <a:schemeClr val="phClr">
-                <a:tint val="80000"/>
-                <a:satMod val="300000"/>
-              </a:schemeClr>
-            </a:gs>
-            <a:gs pos="100000">
-              <a:schemeClr val="phClr">
-                <a:shade val="30000"/>
-                <a:satMod val="200000"/>
-              </a:schemeClr>
-            </a:gs>
-          </a:gsLst>
-          <a:path path="circle">
-            <a:fillToRect l="50000" t="50000" r="50000" b="50000"/>
-          </a:path>
+          <a:lin ang="5400000" scaled="0"/>
         </a:gradFill>
       </a:bgFillStyleLst>
     </a:fmtScheme>
   </a:themeElements>
-  <a:objectDefaults>
-    <a:spDef>
-      <a:spPr/>
-      <a:bodyPr/>
-      <a:lstStyle/>
-      <a:style>
-        <a:lnRef idx="1">
-          <a:schemeClr val="accent1"/>
-        </a:lnRef>
-        <a:fillRef idx="3">
-          <a:schemeClr val="accent1"/>
-        </a:fillRef>
-        <a:effectRef idx="2">
-          <a:schemeClr val="accent1"/>
-        </a:effectRef>
-        <a:fontRef idx="minor">
-          <a:schemeClr val="lt1"/>
-        </a:fontRef>
-      </a:style>
-    </a:spDef>
-    <a:lnDef>
-      <a:spPr/>
-      <a:bodyPr/>
-      <a:lstStyle/>
-      <a:style>
-        <a:lnRef idx="2">
-          <a:schemeClr val="accent1"/>
-        </a:lnRef>
-        <a:fillRef idx="0">
-          <a:schemeClr val="accent1"/>
-        </a:fillRef>
-        <a:effectRef idx="1">
-          <a:schemeClr val="accent1"/>
-        </a:effectRef>
-        <a:fontRef idx="minor">
-          <a:schemeClr val="tx1"/>
-        </a:fontRef>
-      </a:style>
-    </a:lnDef>
-  </a:objectDefaults>
+  <a:objectDefaults/>
   <a:extraClrSchemeLst/>
+  <a:extLst>
+    <a:ext uri="{05A4C25C-085E-4340-85A3-A5531E510DB2}">
+      <thm15:themeFamily xmlns:thm15="http://schemas.microsoft.com/office/thememl/2012/main" name="Office Theme" id="{2E142A2C-CD16-42D6-873A-C26D2A0506FA}" vid="{1BDDFF52-6CD6-40A5-AB3C-68EB2F1E4D0A}"/>
+    </a:ext>
+  </a:extLst>
 </a:theme>
 </file>
</xml_diff>